<commit_message>
Add VA versions and research pain points to the Remote CoWorker messages
Co-Authored-By: Claude Opus 5.5 <noreply@anthropic.com>
Claude-Session: https://claude.ai/code/session_01Lr1syY3hkLeZYJhtN2s4Rg
</commit_message>
<xml_diff>
--- a/Outreach Messages - Remote CoWorker.docx
+++ b/Outreach Messages - Remote CoWorker.docx
@@ -71,7 +71,7 @@
     <w:p>
       <w:r>
         <w:rPr/>
-        <w:t xml:space="preserve">For healthcare, their staff already do scheduling, intake, insurance verification, prior authorization, billing, coding and scribing for US practices. For law firms, they provide intake, reception, legal assistants, paralegals and case managers.</w:t>
+        <w:t xml:space="preserve">For healthcare, their staff already do reception, scheduling, intake, insurance verification, prior authorization, billing, coding and scribing for US practices. For law firms, they provide reception, legal intake, legal assistants, paralegals, case managers, executive assistants and appointment setters.</w:t>
       </w:r>
     </w:p>
     <w:p>
@@ -140,28 +140,7 @@
     <w:p>
       <w:r>
         <w:rPr/>
-        <w:t xml:space="preserve">The trigger is an open job post for an admin role: front desk, scheduling, billing, coding, prior authorization, insurance verification or scribe for ICP 1; intake, receptionist, legal assistant, paralegal or case manager for ICP 2.</w:t>
-      </w:r>
-    </w:p>
-    <w:p>
-      <w:r>
-        <w:rPr/>
-        <w:t xml:space="preserve">As agreed at the kick-off, we contact the C-suite, not HR: the owner, managing physician or managing partner first, and the practice or firm administrator second, since administrators made the decision in Remote CoWorker's own case studies. Hospitals, health systems, large law firms and staffing agencies are excluded.</w:t>
-      </w:r>
-    </w:p>
-    <w:p>
-      <w:pPr>
-        <w:pStyle w:val="Heading2"/>
-      </w:pPr>
-      <w:r>
-        <w:rPr/>
-        <w:t xml:space="preserve">The Strategy</w:t>
-      </w:r>
-    </w:p>
-    <w:p>
-      <w:r>
-        <w:rPr/>
-        <w:t xml:space="preserve">We run the campaign on LinkedIn only, from two profiles, with 100 invitations per profile per week. Each profile takes one ICP, so we can compare the two verticals, as agreed at the kick-off:</w:t>
+        <w:t xml:space="preserve">The trigger is an open job post. Gidon's brief is any company hiring 3 to 10 people overseas, narrowed for this pilot to healthcare and legal, so we look for two kinds of posts:</w:t>
       </w:r>
     </w:p>
     <w:p>
@@ -178,11 +157,11 @@
           <w:b w:val="1"/>
           <w:bCs w:val="1"/>
         </w:rPr>
-        <w:t xml:space="preserve">Nelus Groesbeek (ICP 1, medical practices).</w:t>
-      </w:r>
-      <w:r>
-        <w:rPr/>
-        <w:t xml:space="preserve"> As Director of Business Development with nine years at Remote CoWorker and 500+ connections, his profile carries the most weight with practice owners and physicians, the primary ICP. Healthcare Management is also among his skills.</w:t>
+        <w:t xml:space="preserve">Virtual assistant and remote posts</w:t>
+      </w:r>
+      <w:r>
+        <w:rPr/>
+        <w:t xml:space="preserve"> (virtual assistant, remote receptionist, virtual medical or legal assistant). They already want remote help, so the question is whether they hire someone themselves or use an agency.</w:t>
       </w:r>
     </w:p>
     <w:p>
@@ -199,6 +178,69 @@
           <w:b w:val="1"/>
           <w:bCs w:val="1"/>
         </w:rPr>
+        <w:t xml:space="preserve">Admin posts, on-site or hybrid:</w:t>
+      </w:r>
+      <w:r>
+        <w:rPr/>
+        <w:t xml:space="preserve"> front desk, scheduling, billing, coding, prior authorization, insurance verification or scribe for ICP 1; reception, intake, legal assistant, paralegal or case manager for ICP 2. Only 8.6% of US job posts mention remote work, so this is the larger pool. The question is local hire versus a remote one.</w:t>
+      </w:r>
+    </w:p>
+    <w:p>
+      <w:r>
+        <w:rPr/>
+        <w:t xml:space="preserve">As agreed at the kick-off, we contact the C-suite, not HR: the owner, managing physician or managing partner first, and the practice or firm administrator second, since administrators made the decision in Remote CoWorker's own case studies. Hospitals, health systems, large law firms and staffing agencies are excluded.</w:t>
+      </w:r>
+    </w:p>
+    <w:p>
+      <w:pPr>
+        <w:pStyle w:val="Heading2"/>
+      </w:pPr>
+      <w:r>
+        <w:rPr/>
+        <w:t xml:space="preserve">The Strategy</w:t>
+      </w:r>
+    </w:p>
+    <w:p>
+      <w:r>
+        <w:rPr/>
+        <w:t xml:space="preserve">We run the campaign on LinkedIn only, from two profiles, with 100 invitations per profile per week. Each profile takes one ICP, so we can compare the two verticals, as agreed at the kick-off:</w:t>
+      </w:r>
+    </w:p>
+    <w:p>
+      <w:pPr>
+        <w:numPr>
+          <w:ilvl w:val="0"/>
+          <w:numId w:val="2"/>
+        </w:numPr>
+        <w:spacing w:after="0" w:before="120" w:lineRule="auto"/>
+        <w:ind w:left="720" w:hanging="360"/>
+      </w:pPr>
+      <w:r>
+        <w:rPr>
+          <w:b w:val="1"/>
+          <w:bCs w:val="1"/>
+        </w:rPr>
+        <w:t xml:space="preserve">Nelus Groesbeek (ICP 1, medical practices).</w:t>
+      </w:r>
+      <w:r>
+        <w:rPr/>
+        <w:t xml:space="preserve"> As Director of Business Development with nine years at Remote CoWorker and 500+ connections, his profile carries the most weight with practice owners and physicians, the primary ICP. Healthcare Management is also among his skills.</w:t>
+      </w:r>
+    </w:p>
+    <w:p>
+      <w:pPr>
+        <w:numPr>
+          <w:ilvl w:val="0"/>
+          <w:numId w:val="2"/>
+        </w:numPr>
+        <w:spacing w:after="0" w:before="120" w:lineRule="auto"/>
+        <w:ind w:left="720" w:hanging="360"/>
+      </w:pPr>
+      <w:r>
+        <w:rPr>
+          <w:b w:val="1"/>
+          <w:bCs w:val="1"/>
+        </w:rPr>
         <w:t xml:space="preserve">Ryan Faure (ICP 2, law firms).</w:t>
       </w:r>
       <w:r>
@@ -210,6 +252,34 @@
       <w:r>
         <w:rPr/>
         <w:t xml:space="preserve">Each sequence has a connection request and four messages. Job posts go stale quickly, so the delays are short: the whole sequence runs within about 11 days of the person accepting.</w:t>
+      </w:r>
+    </w:p>
+    <w:p>
+      <w:r>
+        <w:rPr/>
+        <w:t xml:space="preserve">Messages 1 and 2 have a version for each kind of post: the </w:t>
+      </w:r>
+      <w:r>
+        <w:rPr>
+          <w:b w:val="1"/>
+          <w:bCs w:val="1"/>
+        </w:rPr>
+        <w:t xml:space="preserve">VA version</w:t>
+      </w:r>
+      <w:r>
+        <w:rPr/>
+        <w:t xml:space="preserve"> for virtual assistant and remote posts, and the </w:t>
+      </w:r>
+      <w:r>
+        <w:rPr>
+          <w:b w:val="1"/>
+          <w:bCs w:val="1"/>
+        </w:rPr>
+        <w:t xml:space="preserve">admin version</w:t>
+      </w:r>
+      <w:r>
+        <w:rPr/>
+        <w:t xml:space="preserve"> for on-site and hybrid admin posts. Messages 3 and 4 are the same for both.</w:t>
       </w:r>
     </w:p>
     <w:p>
@@ -390,7 +460,7 @@
           <w:iCs w:val="1"/>
           <w:color w:val="1F497D"/>
         </w:rPr>
-        <w:t xml:space="preserve">Main version</w:t>
+        <w:t xml:space="preserve">VA version</w:t>
       </w:r>
     </w:p>
     <w:p>
@@ -459,7 +529,7 @@
           <w:i w:val="1"/>
           <w:iCs w:val="1"/>
         </w:rPr>
-        <w:t xml:space="preserve">. Admin roles have been hard to keep filled for a lot of practices: in MGMA's May 2026 poll, 28% still reported higher staff turnover. Is this a new role, or one you've had to fill before?</w:t>
+        <w:t xml:space="preserve">. Is this one person for now, or the start of a bigger remote team?</w:t>
       </w:r>
     </w:p>
     <w:p>
@@ -474,7 +544,7 @@
           <w:iCs w:val="1"/>
           <w:color w:val="1F497D"/>
         </w:rPr>
-        <w:t xml:space="preserve">For prior authorization, billing and insurance verification posts</w:t>
+        <w:t xml:space="preserve">Admin version (front desk, scheduling, scribe and other admin posts)</w:t>
       </w:r>
     </w:p>
     <w:p>
@@ -543,47 +613,22 @@
           <w:i w:val="1"/>
           <w:iCs w:val="1"/>
         </w:rPr>
-        <w:t xml:space="preserve">. The AMA found practices handle about 39 prior authorizations per physician every week, taking around 13 hours of physician and staff time. Is the new hire meant to take that off the team?</w:t>
-      </w:r>
-    </w:p>
-    <w:p>
-      <w:pPr>
-        <w:spacing w:before="60" w:after="120"/>
-      </w:pPr>
-      <w:r>
-        <w:rPr>
-          <w:i w:val="1"/>
-          <w:iCs w:val="1"/>
-          <w:color w:val="404040"/>
-          <w:sz w:val="22"/>
-          <w:szCs w:val="22"/>
-        </w:rPr>
-        <w:t xml:space="preserve">Response suggestion: if it's a repeat vacancy, ask how long people usually stay in the role. If it's a new role, ask what they want it to take off the team. Both lead into message 2.</w:t>
-      </w:r>
-    </w:p>
-    <w:p>
-      <w:pPr>
-        <w:pStyle w:val="Heading4"/>
-      </w:pPr>
-      <w:r>
-        <w:rPr/>
-        <w:t xml:space="preserve">2</w:t>
-      </w:r>
-      <w:r>
-        <w:rPr>
-          <w:vertAlign w:val="superscript"/>
-        </w:rPr>
-        <w:t xml:space="preserve">nd</w:t>
-      </w:r>
-      <w:r>
-        <w:rPr/>
-        <w:t xml:space="preserve"> Follow-up (3 days after the previous message)</w:t>
-      </w:r>
-    </w:p>
-    <w:p>
-      <w:r>
-        <w:rPr/>
-        <w:t xml:space="preserve">If there's no reply, we introduce ourselves and put the cost side by side: what this role usually costs locally, and what a dedicated remote hire costs with Remote CoWorker.</w:t>
+        <w:t xml:space="preserve">. Front-desk roles seem hard to keep filled for a lot of practices right now: in MGMA's May 2026 poll, 28% still reported higher staff turnover. Is this a new role, or one you've had to fill before?</w:t>
+      </w:r>
+    </w:p>
+    <w:p>
+      <w:pPr>
+        <w:spacing w:before="240" w:after="0"/>
+      </w:pPr>
+      <w:r>
+        <w:rPr>
+          <w:b w:val="1"/>
+          <w:bCs w:val="1"/>
+          <w:i w:val="1"/>
+          <w:iCs w:val="1"/>
+          <w:color w:val="1F497D"/>
+        </w:rPr>
+        <w:t xml:space="preserve">Admin version (prior authorization, billing and insurance verification posts)</w:t>
       </w:r>
     </w:p>
     <w:p>
@@ -601,7 +646,7 @@
           <w:i w:val="1"/>
           <w:iCs w:val="1"/>
         </w:rPr>
-        <w:t xml:space="preserve">I should have introduced myself, </w:t>
+        <w:t xml:space="preserve">Thanks for connecting, </w:t>
       </w:r>
       <w:r>
         <w:rPr>
@@ -618,7 +663,24 @@
           <w:i w:val="1"/>
           <w:iCs w:val="1"/>
         </w:rPr>
-        <w:t xml:space="preserve">. I'm Nelus, Director of Business Development at Remote CoWorker. We place dedicated remote staff with US practices: front desk, scheduling, insurance verification, prior authorization, billing, coding and scribing. A local medical secretary earns a median $45,930 a year before benefits. A full-time remote hire with us starts at $7.99 an hour, about $16,600 a year, with recruiting, HR, payroll and IT included. Would it make sense to look at the </w:t>
+        <w:t xml:space="preserve">. I saw </w:t>
+      </w:r>
+      <w:r>
+        <w:rPr>
+          <w:b w:val="1"/>
+          <w:bCs w:val="1"/>
+          <w:i w:val="1"/>
+          <w:iCs w:val="1"/>
+          <w:color w:val="FF9900"/>
+        </w:rPr>
+        <w:t xml:space="preserve">{company name}</w:t>
+      </w:r>
+      <w:r>
+        <w:rPr>
+          <w:i w:val="1"/>
+          <w:iCs w:val="1"/>
+        </w:rPr>
+        <w:t xml:space="preserve"> is hiring a </w:t>
       </w:r>
       <w:r>
         <w:rPr>
@@ -635,7 +697,7 @@
           <w:i w:val="1"/>
           <w:iCs w:val="1"/>
         </w:rPr>
-        <w:t xml:space="preserve"> role this way?</w:t>
+        <w:t xml:space="preserve">. The AMA found practices handle about 39 prior authorizations per physician every week, which takes around 13 hours of physician and staff time. Is the new hire meant to take that off the team?</w:t>
       </w:r>
     </w:p>
     <w:p>
@@ -650,7 +712,7 @@
           <w:sz w:val="22"/>
           <w:szCs w:val="22"/>
         </w:rPr>
-        <w:t xml:space="preserve">Response suggestion: if they ask about patient data, the website lists HIPAA compliance, ISO 27001 and SOC 2. Confirm the details with Gidon before going further. If they say the role must be on-site, ask which parts of it could be done remotely, such as calls, scheduling or insurance work.</w:t>
+        <w:t xml:space="preserve">Response suggestion: if they're planning more hires, ask which roles come next. If it's a repeat vacancy, ask how long people usually stay in the role. If it's prior authorization, ask who handles it today. Every answer leads into message 2.</w:t>
       </w:r>
     </w:p>
     <w:p>
@@ -659,13 +721,13 @@
       </w:pPr>
       <w:r>
         <w:rPr/>
-        <w:t xml:space="preserve">3</w:t>
+        <w:t xml:space="preserve">2</w:t>
       </w:r>
       <w:r>
         <w:rPr>
           <w:vertAlign w:val="superscript"/>
         </w:rPr>
-        <w:t xml:space="preserve">rd</w:t>
+        <w:t xml:space="preserve">nd</w:t>
       </w:r>
       <w:r>
         <w:rPr/>
@@ -675,7 +737,22 @@
     <w:p>
       <w:r>
         <w:rPr/>
-        <w:t xml:space="preserve">Proof from a real client, and the free consultation as the next step.</w:t>
+        <w:t xml:space="preserve">If there's no reply, we introduce ourselves and put the cost side by side: what this role usually costs locally, and what a dedicated remote hire costs with Remote CoWorker.</w:t>
+      </w:r>
+    </w:p>
+    <w:p>
+      <w:pPr>
+        <w:spacing w:before="240" w:after="0"/>
+      </w:pPr>
+      <w:r>
+        <w:rPr>
+          <w:b w:val="1"/>
+          <w:bCs w:val="1"/>
+          <w:i w:val="1"/>
+          <w:iCs w:val="1"/>
+          <w:color w:val="1F497D"/>
+        </w:rPr>
+        <w:t xml:space="preserve">VA version</w:t>
       </w:r>
     </w:p>
     <w:p>
@@ -693,7 +770,7 @@
           <w:i w:val="1"/>
           <w:iCs w:val="1"/>
         </w:rPr>
-        <w:t xml:space="preserve">One example, </w:t>
+        <w:t xml:space="preserve">I should have introduced myself, </w:t>
       </w:r>
       <w:r>
         <w:rPr>
@@ -710,7 +787,7 @@
           <w:i w:val="1"/>
           <w:iCs w:val="1"/>
         </w:rPr>
-        <w:t xml:space="preserve">. An optometry practice in Michigan started with us in September 2025 and now has a 6 to 10 person remote team handling patient calls, scheduling and fee collection. They report higher call rates and completed collections. You interview every candidate before committing, and each hire has an Accountability Manager. Happy to do a free call to map out the </w:t>
+        <w:t xml:space="preserve">. I'm Nelus, Director of Business Development at Remote CoWorker. Hiring a remote assistant yourself means doing the screening, payroll and IT, and starting over when someone leaves. We take all of that on, from $7.99 an hour, and you still interview every candidate. Our people already handle reception, scheduling, insurance verification, billing, coding and scribing for US practices. Would it make sense to look at the </w:t>
       </w:r>
       <w:r>
         <w:rPr>
@@ -727,47 +804,22 @@
           <w:i w:val="1"/>
           <w:iCs w:val="1"/>
         </w:rPr>
-        <w:t xml:space="preserve"> role and what it would cost. Would next week work?</w:t>
-      </w:r>
-    </w:p>
-    <w:p>
-      <w:pPr>
-        <w:spacing w:before="60" w:after="120"/>
-      </w:pPr>
-      <w:r>
-        <w:rPr>
-          <w:i w:val="1"/>
-          <w:iCs w:val="1"/>
-          <w:color w:val="404040"/>
-          <w:sz w:val="22"/>
-          <w:szCs w:val="22"/>
-        </w:rPr>
-        <w:t xml:space="preserve">Response suggestion: if they say yes, book the call in Nelus's calendar. If they're interested but not ready, offer the $300 off the first month as a reason to start with one hire.</w:t>
-      </w:r>
-    </w:p>
-    <w:p>
-      <w:pPr>
-        <w:pStyle w:val="Heading4"/>
-      </w:pPr>
-      <w:r>
-        <w:rPr/>
-        <w:t xml:space="preserve">4</w:t>
-      </w:r>
-      <w:r>
-        <w:rPr>
-          <w:vertAlign w:val="superscript"/>
-        </w:rPr>
-        <w:t xml:space="preserve">th</w:t>
-      </w:r>
-      <w:r>
-        <w:rPr/>
-        <w:t xml:space="preserve"> Follow-up (4 days after the previous message)</w:t>
-      </w:r>
-    </w:p>
-    <w:p>
-      <w:r>
-        <w:rPr/>
-        <w:t xml:space="preserve">The last message. It keeps the door open, even if the role has been filled, and gives a direct link to book a call.</w:t>
+        <w:t xml:space="preserve"> role this way?</w:t>
+      </w:r>
+    </w:p>
+    <w:p>
+      <w:pPr>
+        <w:spacing w:before="240" w:after="0"/>
+      </w:pPr>
+      <w:r>
+        <w:rPr>
+          <w:b w:val="1"/>
+          <w:bCs w:val="1"/>
+          <w:i w:val="1"/>
+          <w:iCs w:val="1"/>
+          <w:color w:val="1F497D"/>
+        </w:rPr>
+        <w:t xml:space="preserve">Admin version</w:t>
       </w:r>
     </w:p>
     <w:p>
@@ -785,7 +837,7 @@
           <w:i w:val="1"/>
           <w:iCs w:val="1"/>
         </w:rPr>
-        <w:t xml:space="preserve">Last message from me, </w:t>
+        <w:t xml:space="preserve">I should have introduced myself, </w:t>
       </w:r>
       <w:r>
         <w:rPr>
@@ -802,7 +854,7 @@
           <w:i w:val="1"/>
           <w:iCs w:val="1"/>
         </w:rPr>
-        <w:t xml:space="preserve">. If the </w:t>
+        <w:t xml:space="preserve">. I'm Nelus, Director of Business Development at Remote CoWorker. Front-desk pay has gone up 22% in five years, and a local medical secretary now earns a median $45,930 a year before benefits. A full-time remote hire with us starts at $7.99 an hour, about $16,600 a year, with recruiting, HR, payroll and IT included. Would it make sense to look at the </w:t>
       </w:r>
       <w:r>
         <w:rPr>
@@ -819,17 +871,7 @@
           <w:i w:val="1"/>
           <w:iCs w:val="1"/>
         </w:rPr>
-        <w:t xml:space="preserve"> role is filled, no problem. Some of our biggest client teams started with a single hire, and if a hire isn't the right fit, we replace them at no extra cost. If it's ever useful, you can grab a time with me here: </w:t>
-      </w:r>
-      <w:r>
-        <w:rPr>
-          <w:b w:val="1"/>
-          <w:bCs w:val="1"/>
-          <w:i w:val="1"/>
-          <w:iCs w:val="1"/>
-          <w:color w:val="FF9900"/>
-        </w:rPr>
-        <w:t xml:space="preserve">{booking link}</w:t>
+        <w:t xml:space="preserve"> role this way?</w:t>
       </w:r>
     </w:p>
     <w:p>
@@ -844,133 +886,7 @@
           <w:sz w:val="22"/>
           <w:szCs w:val="22"/>
         </w:rPr>
-        <w:t xml:space="preserve">Response suggestion: if there's no reply, they leave the sequence. We don't contact them again unless they post a new admin role.</w:t>
-      </w:r>
-    </w:p>
-    <w:p>
-      <w:pPr>
-        <w:pStyle w:val="Heading2"/>
-      </w:pPr>
-      <w:r>
-        <w:rPr/>
-        <w:t xml:space="preserve">Ryan — ICP 2: Consumer-Facing Law Firms</w:t>
-      </w:r>
-    </w:p>
-    <w:p>
-      <w:pPr>
-        <w:pStyle w:val="Heading3"/>
-      </w:pPr>
-      <w:r>
-        <w:rPr/>
-        <w:t xml:space="preserve">Connection Request</w:t>
-      </w:r>
-    </w:p>
-    <w:p>
-      <w:r>
-        <w:rPr/>
-        <w:t xml:space="preserve">The same approach as for ICP 1:</w:t>
-      </w:r>
-    </w:p>
-    <w:p>
-      <w:pPr>
-        <w:numPr>
-          <w:ilvl w:val="0"/>
-          <w:numId w:val="1"/>
-        </w:numPr>
-        <w:spacing w:after="0" w:before="60" w:line="240" w:lineRule="auto"/>
-        <w:ind w:left="1584" w:right="864" w:hanging="360"/>
-      </w:pPr>
-      <w:r>
-        <w:rPr>
-          <w:i w:val="1"/>
-          <w:iCs w:val="1"/>
-        </w:rPr>
-        <w:t xml:space="preserve">Hi </w:t>
-      </w:r>
-      <w:r>
-        <w:rPr>
-          <w:b w:val="1"/>
-          <w:bCs w:val="1"/>
-          <w:i w:val="1"/>
-          <w:iCs w:val="1"/>
-          <w:color w:val="FF9900"/>
-        </w:rPr>
-        <w:t xml:space="preserve">[First Name]</w:t>
-      </w:r>
-      <w:r>
-        <w:rPr>
-          <w:i w:val="1"/>
-          <w:iCs w:val="1"/>
-        </w:rPr>
-        <w:t xml:space="preserve">, I'd love to connect.</w:t>
-      </w:r>
-    </w:p>
-    <w:p>
-      <w:pPr>
-        <w:numPr>
-          <w:ilvl w:val="0"/>
-          <w:numId w:val="1"/>
-        </w:numPr>
-        <w:spacing w:after="0" w:before="60" w:line="240" w:lineRule="auto"/>
-        <w:ind w:left="1584" w:right="864" w:hanging="360"/>
-      </w:pPr>
-      <w:r>
-        <w:rPr>
-          <w:i w:val="1"/>
-          <w:iCs w:val="1"/>
-        </w:rPr>
-        <w:t xml:space="preserve">Hi </w:t>
-      </w:r>
-      <w:r>
-        <w:rPr>
-          <w:b w:val="1"/>
-          <w:bCs w:val="1"/>
-          <w:i w:val="1"/>
-          <w:iCs w:val="1"/>
-          <w:color w:val="FF9900"/>
-        </w:rPr>
-        <w:t xml:space="preserve">[First Name]</w:t>
-      </w:r>
-      <w:r>
-        <w:rPr>
-          <w:i w:val="1"/>
-          <w:iCs w:val="1"/>
-        </w:rPr>
-        <w:t xml:space="preserve">, I see </w:t>
-      </w:r>
-      <w:r>
-        <w:rPr>
-          <w:b w:val="1"/>
-          <w:bCs w:val="1"/>
-          <w:i w:val="1"/>
-          <w:iCs w:val="1"/>
-          <w:color w:val="FF9900"/>
-        </w:rPr>
-        <w:t xml:space="preserve">{company name}</w:t>
-      </w:r>
-      <w:r>
-        <w:rPr>
-          <w:i w:val="1"/>
-          <w:iCs w:val="1"/>
-        </w:rPr>
-        <w:t xml:space="preserve"> is growing the team. Would be great to connect.</w:t>
-      </w:r>
-    </w:p>
-    <w:p>
-      <w:pPr>
-        <w:numPr>
-          <w:ilvl w:val="0"/>
-          <w:numId w:val="1"/>
-        </w:numPr>
-        <w:spacing w:after="0" w:before="60" w:line="240" w:lineRule="auto"/>
-        <w:ind w:left="1584" w:right="864" w:hanging="360"/>
-      </w:pPr>
-      <w:r>
-        <w:rPr>
-          <w:i w:val="1"/>
-          <w:iCs w:val="1"/>
-        </w:rPr>
-        <w:t xml:space="preserve">Blank invitation</w:t>
+        <w:t xml:space="preserve">Response suggestion: if they ask about patient data, the website lists HIPAA compliance, ISO 27001 and SOC 2; confirm the details with Gidon before going further. If they say the role has to be on-site, ask which parts could be done remotely, such as calls, scheduling, insurance checks or billing.</w:t>
       </w:r>
     </w:p>
     <w:p>
@@ -979,23 +895,23 @@
       </w:pPr>
       <w:r>
         <w:rPr/>
-        <w:t xml:space="preserve">1</w:t>
+        <w:t xml:space="preserve">3</w:t>
       </w:r>
       <w:r>
         <w:rPr>
           <w:vertAlign w:val="superscript"/>
         </w:rPr>
-        <w:t xml:space="preserve">st</w:t>
-      </w:r>
-      <w:r>
-        <w:rPr/>
-        <w:t xml:space="preserve"> Follow-up (1 day after they accept)</w:t>
-      </w:r>
-    </w:p>
-    <w:p>
-      <w:r>
-        <w:rPr/>
-        <w:t xml:space="preserve">Sent one day after they accept. It mentions the role they're hiring for and one fact about that kind of hire, and ends with an easy question. No pitch yet: the goal is a reply.</w:t>
+        <w:t xml:space="preserve">rd</w:t>
+      </w:r>
+      <w:r>
+        <w:rPr/>
+        <w:t xml:space="preserve"> Follow-up (3 days after the previous message)</w:t>
+      </w:r>
+    </w:p>
+    <w:p>
+      <w:r>
+        <w:rPr/>
+        <w:t xml:space="preserve">Proof from a real client, and the free consultation as the next step.</w:t>
       </w:r>
     </w:p>
     <w:p>
@@ -1013,7 +929,7 @@
           <w:i w:val="1"/>
           <w:iCs w:val="1"/>
         </w:rPr>
-        <w:t xml:space="preserve">Thanks for connecting, </w:t>
+        <w:t xml:space="preserve">One example, </w:t>
       </w:r>
       <w:r>
         <w:rPr>
@@ -1030,24 +946,7 @@
           <w:i w:val="1"/>
           <w:iCs w:val="1"/>
         </w:rPr>
-        <w:t xml:space="preserve">. I saw </w:t>
-      </w:r>
-      <w:r>
-        <w:rPr>
-          <w:b w:val="1"/>
-          <w:bCs w:val="1"/>
-          <w:i w:val="1"/>
-          <w:iCs w:val="1"/>
-          <w:color w:val="FF9900"/>
-        </w:rPr>
-        <w:t xml:space="preserve">{company name}</w:t>
-      </w:r>
-      <w:r>
-        <w:rPr>
-          <w:i w:val="1"/>
-          <w:iCs w:val="1"/>
-        </w:rPr>
-        <w:t xml:space="preserve"> is hiring a </w:t>
+        <w:t xml:space="preserve">. An optometry practice in Michigan has had a 6 to 10 person remote team with us since September 2025, handling patient calls, scheduling and fee collection. They've seen higher call rates and completed collections. You interview every candidate before committing, and each hire has an Accountability Manager, so you see the work without managing every detail. Happy to do a free call to map out the </w:t>
       </w:r>
       <w:r>
         <w:rPr>
@@ -1064,7 +963,7 @@
           <w:i w:val="1"/>
           <w:iCs w:val="1"/>
         </w:rPr>
-        <w:t xml:space="preserve">. In a secret-shopper test of 500 US law firms, only 40% answered the phone. Is this hire mainly about intake and calls, or more about supporting the attorneys?</w:t>
+        <w:t xml:space="preserve"> role and what it would cost. Would next week work?</w:t>
       </w:r>
     </w:p>
     <w:p>
@@ -1079,7 +978,7 @@
           <w:sz w:val="22"/>
           <w:szCs w:val="22"/>
         </w:rPr>
-        <w:t xml:space="preserve">Response suggestion: if it's intake, ask what happens to calls today when nobody picks up. If it's attorney support, ask how much of the attorneys' day goes on admin. Lawyers bill on average about 3 hours of an eight-hour day (Clio), which is a useful follow-up.</w:t>
+        <w:t xml:space="preserve">Response suggestion: if they say yes, book the call in Nelus's calendar. If they're interested but not ready, offer $300 off the first month as a reason to start with one hire.</w:t>
       </w:r>
     </w:p>
     <w:p>
@@ -1088,38 +987,23 @@
       </w:pPr>
       <w:r>
         <w:rPr/>
-        <w:t xml:space="preserve">2</w:t>
+        <w:t xml:space="preserve">4</w:t>
       </w:r>
       <w:r>
         <w:rPr>
           <w:vertAlign w:val="superscript"/>
         </w:rPr>
-        <w:t xml:space="preserve">nd</w:t>
-      </w:r>
-      <w:r>
-        <w:rPr/>
-        <w:t xml:space="preserve"> Follow-up (3 days after the previous message)</w:t>
-      </w:r>
-    </w:p>
-    <w:p>
-      <w:r>
-        <w:rPr/>
-        <w:t xml:space="preserve">If there's no reply, we introduce ourselves and put the cost side by side: what this role usually costs locally, and what a dedicated remote hire costs with Remote CoWorker.</w:t>
-      </w:r>
-    </w:p>
-    <w:p>
-      <w:pPr>
-        <w:spacing w:before="240" w:after="0"/>
-      </w:pPr>
-      <w:r>
-        <w:rPr>
-          <w:b w:val="1"/>
-          <w:bCs w:val="1"/>
-          <w:i w:val="1"/>
-          <w:iCs w:val="1"/>
-          <w:color w:val="1F497D"/>
-        </w:rPr>
-        <w:t xml:space="preserve">For intake, receptionist and legal assistant posts</w:t>
+        <w:t xml:space="preserve">th</w:t>
+      </w:r>
+      <w:r>
+        <w:rPr/>
+        <w:t xml:space="preserve"> Follow-up (4 days after the previous message)</w:t>
+      </w:r>
+    </w:p>
+    <w:p>
+      <w:r>
+        <w:rPr/>
+        <w:t xml:space="preserve">The last message. It keeps the door open, even if the role has been filled, and gives a direct link to book a call.</w:t>
       </w:r>
     </w:p>
     <w:p>
@@ -1137,7 +1021,7 @@
           <w:i w:val="1"/>
           <w:iCs w:val="1"/>
         </w:rPr>
-        <w:t xml:space="preserve">I should have introduced myself, </w:t>
+        <w:t xml:space="preserve">Last message from me, </w:t>
       </w:r>
       <w:r>
         <w:rPr>
@@ -1154,7 +1038,7 @@
           <w:i w:val="1"/>
           <w:iCs w:val="1"/>
         </w:rPr>
-        <w:t xml:space="preserve">. I'm Ryan from Remote CoWorker. We place dedicated remote staff with US law firms: intake, reception, legal assistants, paralegals and case managers. A local legal secretary earns a median $55,570 a year before benefits. A full-time remote hire with us starts at $7.99 an hour, about $16,600 a year, with recruiting, HR, payroll and IT included. Would it make sense to look at the </w:t>
+        <w:t xml:space="preserve">. If the </w:t>
       </w:r>
       <w:r>
         <w:rPr>
@@ -1171,7 +1055,183 @@
           <w:i w:val="1"/>
           <w:iCs w:val="1"/>
         </w:rPr>
-        <w:t xml:space="preserve"> role this way?</w:t>
+        <w:t xml:space="preserve"> role is still open, our clients usually have their hire in place within one to three weeks, and if someone isn't the right fit, we replace them at no extra cost. If it's useful, you can pick a time with me here: </w:t>
+      </w:r>
+      <w:r>
+        <w:rPr>
+          <w:b w:val="1"/>
+          <w:bCs w:val="1"/>
+          <w:i w:val="1"/>
+          <w:iCs w:val="1"/>
+          <w:color w:val="FF9900"/>
+        </w:rPr>
+        <w:t xml:space="preserve">{booking link}</w:t>
+      </w:r>
+    </w:p>
+    <w:p>
+      <w:pPr>
+        <w:spacing w:before="60" w:after="120"/>
+      </w:pPr>
+      <w:r>
+        <w:rPr>
+          <w:i w:val="1"/>
+          <w:iCs w:val="1"/>
+          <w:color w:val="404040"/>
+          <w:sz w:val="22"/>
+          <w:szCs w:val="22"/>
+        </w:rPr>
+        <w:t xml:space="preserve">Response suggestion: if the role has been filled, ask whether more admin hires are coming this year, and stay in touch. If there's no reply, they leave the sequence until they post a new role.</w:t>
+      </w:r>
+    </w:p>
+    <w:p>
+      <w:pPr>
+        <w:pStyle w:val="Heading2"/>
+      </w:pPr>
+      <w:r>
+        <w:rPr/>
+        <w:t xml:space="preserve">Ryan — ICP 2: Consumer-Facing Law Firms</w:t>
+      </w:r>
+    </w:p>
+    <w:p>
+      <w:pPr>
+        <w:pStyle w:val="Heading3"/>
+      </w:pPr>
+      <w:r>
+        <w:rPr/>
+        <w:t xml:space="preserve">Connection Request</w:t>
+      </w:r>
+    </w:p>
+    <w:p>
+      <w:r>
+        <w:rPr/>
+        <w:t xml:space="preserve">The same approach as for ICP 1:</w:t>
+      </w:r>
+    </w:p>
+    <w:p>
+      <w:pPr>
+        <w:numPr>
+          <w:ilvl w:val="0"/>
+          <w:numId w:val="1"/>
+        </w:numPr>
+        <w:spacing w:after="0" w:before="60" w:line="240" w:lineRule="auto"/>
+        <w:ind w:left="1584" w:right="864" w:hanging="360"/>
+      </w:pPr>
+      <w:r>
+        <w:rPr>
+          <w:i w:val="1"/>
+          <w:iCs w:val="1"/>
+        </w:rPr>
+        <w:t xml:space="preserve">Hi </w:t>
+      </w:r>
+      <w:r>
+        <w:rPr>
+          <w:b w:val="1"/>
+          <w:bCs w:val="1"/>
+          <w:i w:val="1"/>
+          <w:iCs w:val="1"/>
+          <w:color w:val="FF9900"/>
+        </w:rPr>
+        <w:t xml:space="preserve">[First Name]</w:t>
+      </w:r>
+      <w:r>
+        <w:rPr>
+          <w:i w:val="1"/>
+          <w:iCs w:val="1"/>
+        </w:rPr>
+        <w:t xml:space="preserve">, I'd love to connect.</w:t>
+      </w:r>
+    </w:p>
+    <w:p>
+      <w:pPr>
+        <w:numPr>
+          <w:ilvl w:val="0"/>
+          <w:numId w:val="1"/>
+        </w:numPr>
+        <w:spacing w:after="0" w:before="60" w:line="240" w:lineRule="auto"/>
+        <w:ind w:left="1584" w:right="864" w:hanging="360"/>
+      </w:pPr>
+      <w:r>
+        <w:rPr>
+          <w:i w:val="1"/>
+          <w:iCs w:val="1"/>
+        </w:rPr>
+        <w:t xml:space="preserve">Hi </w:t>
+      </w:r>
+      <w:r>
+        <w:rPr>
+          <w:b w:val="1"/>
+          <w:bCs w:val="1"/>
+          <w:i w:val="1"/>
+          <w:iCs w:val="1"/>
+          <w:color w:val="FF9900"/>
+        </w:rPr>
+        <w:t xml:space="preserve">[First Name]</w:t>
+      </w:r>
+      <w:r>
+        <w:rPr>
+          <w:i w:val="1"/>
+          <w:iCs w:val="1"/>
+        </w:rPr>
+        <w:t xml:space="preserve">, I see </w:t>
+      </w:r>
+      <w:r>
+        <w:rPr>
+          <w:b w:val="1"/>
+          <w:bCs w:val="1"/>
+          <w:i w:val="1"/>
+          <w:iCs w:val="1"/>
+          <w:color w:val="FF9900"/>
+        </w:rPr>
+        <w:t xml:space="preserve">{company name}</w:t>
+      </w:r>
+      <w:r>
+        <w:rPr>
+          <w:i w:val="1"/>
+          <w:iCs w:val="1"/>
+        </w:rPr>
+        <w:t xml:space="preserve"> is growing the team. Would be great to connect.</w:t>
+      </w:r>
+    </w:p>
+    <w:p>
+      <w:pPr>
+        <w:numPr>
+          <w:ilvl w:val="0"/>
+          <w:numId w:val="1"/>
+        </w:numPr>
+        <w:spacing w:after="0" w:before="60" w:line="240" w:lineRule="auto"/>
+        <w:ind w:left="1584" w:right="864" w:hanging="360"/>
+      </w:pPr>
+      <w:r>
+        <w:rPr>
+          <w:i w:val="1"/>
+          <w:iCs w:val="1"/>
+        </w:rPr>
+        <w:t xml:space="preserve">Blank invitation</w:t>
+      </w:r>
+    </w:p>
+    <w:p>
+      <w:pPr>
+        <w:pStyle w:val="Heading4"/>
+      </w:pPr>
+      <w:r>
+        <w:rPr/>
+        <w:t xml:space="preserve">1</w:t>
+      </w:r>
+      <w:r>
+        <w:rPr>
+          <w:vertAlign w:val="superscript"/>
+        </w:rPr>
+        <w:t xml:space="preserve">st</w:t>
+      </w:r>
+      <w:r>
+        <w:rPr/>
+        <w:t xml:space="preserve"> Follow-up (1 day after they accept)</w:t>
+      </w:r>
+    </w:p>
+    <w:p>
+      <w:r>
+        <w:rPr/>
+        <w:t xml:space="preserve">Sent one day after they accept. It mentions the role they're hiring for and one fact about that kind of hire, and ends with an easy question. No pitch yet: the goal is a reply.</w:t>
       </w:r>
     </w:p>
     <w:p>
@@ -1186,7 +1246,7 @@
           <w:iCs w:val="1"/>
           <w:color w:val="1F497D"/>
         </w:rPr>
-        <w:t xml:space="preserve">For paralegal and case manager posts</w:t>
+        <w:t xml:space="preserve">VA version</w:t>
       </w:r>
     </w:p>
     <w:p>
@@ -1204,7 +1264,7 @@
           <w:i w:val="1"/>
           <w:iCs w:val="1"/>
         </w:rPr>
-        <w:t xml:space="preserve">I should have introduced myself, </w:t>
+        <w:t xml:space="preserve">Thanks for connecting, </w:t>
       </w:r>
       <w:r>
         <w:rPr>
@@ -1221,7 +1281,24 @@
           <w:i w:val="1"/>
           <w:iCs w:val="1"/>
         </w:rPr>
-        <w:t xml:space="preserve">. I'm Ryan from Remote CoWorker. We place dedicated remote staff with US law firms: intake, reception, legal assistants, paralegals and case managers. A local paralegal earns a median $62,890 a year before benefits. A full-time remote hire with us starts at $7.99 an hour, about $16,600 a year, with recruiting, HR, payroll and IT included. Would it make sense to look at the </w:t>
+        <w:t xml:space="preserve">. I saw </w:t>
+      </w:r>
+      <w:r>
+        <w:rPr>
+          <w:b w:val="1"/>
+          <w:bCs w:val="1"/>
+          <w:i w:val="1"/>
+          <w:iCs w:val="1"/>
+          <w:color w:val="FF9900"/>
+        </w:rPr>
+        <w:t xml:space="preserve">{company name}</w:t>
+      </w:r>
+      <w:r>
+        <w:rPr>
+          <w:i w:val="1"/>
+          <w:iCs w:val="1"/>
+        </w:rPr>
+        <w:t xml:space="preserve"> is hiring a </w:t>
       </w:r>
       <w:r>
         <w:rPr>
@@ -1238,47 +1315,22 @@
           <w:i w:val="1"/>
           <w:iCs w:val="1"/>
         </w:rPr>
-        <w:t xml:space="preserve"> role this way?</w:t>
-      </w:r>
-    </w:p>
-    <w:p>
-      <w:pPr>
-        <w:spacing w:before="60" w:after="120"/>
-      </w:pPr>
-      <w:r>
-        <w:rPr>
-          <w:i w:val="1"/>
-          <w:iCs w:val="1"/>
-          <w:color w:val="404040"/>
-          <w:sz w:val="22"/>
-          <w:szCs w:val="22"/>
-        </w:rPr>
-        <w:t xml:space="preserve">Response suggestion: if a firm administrator asks about supervision (lawyers are responsible for supervising non-lawyer staff), explain the Accountability Manager and the work analytics software. Don't mention security certifications until Gidon confirms them for legal.</w:t>
-      </w:r>
-    </w:p>
-    <w:p>
-      <w:pPr>
-        <w:pStyle w:val="Heading4"/>
-      </w:pPr>
-      <w:r>
-        <w:rPr/>
-        <w:t xml:space="preserve">3</w:t>
-      </w:r>
-      <w:r>
-        <w:rPr>
-          <w:vertAlign w:val="superscript"/>
-        </w:rPr>
-        <w:t xml:space="preserve">rd</w:t>
-      </w:r>
-      <w:r>
-        <w:rPr/>
-        <w:t xml:space="preserve"> Follow-up (3 days after the previous message)</w:t>
-      </w:r>
-    </w:p>
-    <w:p>
-      <w:r>
-        <w:rPr/>
-        <w:t xml:space="preserve">Proof from a real client, and the free consultation as the next step.</w:t>
+        <w:t xml:space="preserve">. Is this one person for now, or the start of a bigger remote team?</w:t>
+      </w:r>
+    </w:p>
+    <w:p>
+      <w:pPr>
+        <w:spacing w:before="240" w:after="0"/>
+      </w:pPr>
+      <w:r>
+        <w:rPr>
+          <w:b w:val="1"/>
+          <w:bCs w:val="1"/>
+          <w:i w:val="1"/>
+          <w:iCs w:val="1"/>
+          <w:color w:val="1F497D"/>
+        </w:rPr>
+        <w:t xml:space="preserve">Admin version (intake and receptionist posts)</w:t>
       </w:r>
     </w:p>
     <w:p>
@@ -1296,7 +1348,7 @@
           <w:i w:val="1"/>
           <w:iCs w:val="1"/>
         </w:rPr>
-        <w:t xml:space="preserve">One example, </w:t>
+        <w:t xml:space="preserve">Thanks for connecting, </w:t>
       </w:r>
       <w:r>
         <w:rPr>
@@ -1313,7 +1365,24 @@
           <w:i w:val="1"/>
           <w:iCs w:val="1"/>
         </w:rPr>
-        <w:t xml:space="preserve">. A California law firm started with one remote intake manager. Three years later, they have 17 remote staff across reception, intake, auditing, accounting and marketing, and several have been with them for over three years. You interview every candidate before committing. Happy to do a free call to map out the </w:t>
+        <w:t xml:space="preserve">. I saw </w:t>
+      </w:r>
+      <w:r>
+        <w:rPr>
+          <w:b w:val="1"/>
+          <w:bCs w:val="1"/>
+          <w:i w:val="1"/>
+          <w:iCs w:val="1"/>
+          <w:color w:val="FF9900"/>
+        </w:rPr>
+        <w:t xml:space="preserve">{company name}</w:t>
+      </w:r>
+      <w:r>
+        <w:rPr>
+          <w:i w:val="1"/>
+          <w:iCs w:val="1"/>
+        </w:rPr>
+        <w:t xml:space="preserve"> is hiring a </w:t>
       </w:r>
       <w:r>
         <w:rPr>
@@ -1330,47 +1399,22 @@
           <w:i w:val="1"/>
           <w:iCs w:val="1"/>
         </w:rPr>
-        <w:t xml:space="preserve"> role and what it would cost. Would next week work?</w:t>
-      </w:r>
-    </w:p>
-    <w:p>
-      <w:pPr>
-        <w:spacing w:before="60" w:after="120"/>
-      </w:pPr>
-      <w:r>
-        <w:rPr>
-          <w:i w:val="1"/>
-          <w:iCs w:val="1"/>
-          <w:color w:val="404040"/>
-          <w:sz w:val="22"/>
-          <w:szCs w:val="22"/>
-        </w:rPr>
-        <w:t xml:space="preserve">Response suggestion: if they say yes, book the call in Ryan's calendar. If they're interested but not ready, offer the $300 off the first month as a reason to start with one hire.</w:t>
-      </w:r>
-    </w:p>
-    <w:p>
-      <w:pPr>
-        <w:pStyle w:val="Heading4"/>
-      </w:pPr>
-      <w:r>
-        <w:rPr/>
-        <w:t xml:space="preserve">4</w:t>
-      </w:r>
-      <w:r>
-        <w:rPr>
-          <w:vertAlign w:val="superscript"/>
-        </w:rPr>
-        <w:t xml:space="preserve">th</w:t>
-      </w:r>
-      <w:r>
-        <w:rPr/>
-        <w:t xml:space="preserve"> Follow-up (4 days after the previous message)</w:t>
-      </w:r>
-    </w:p>
-    <w:p>
-      <w:r>
-        <w:rPr/>
-        <w:t xml:space="preserve">The last message. It keeps the door open, even if the role has been filled, and gives a direct link to book a call.</w:t>
+        <w:t xml:space="preserve">. In a secret-shopper test of 500 US law firms, only 40% answered the phone. Is this hire meant to make sure every call gets picked up?</w:t>
+      </w:r>
+    </w:p>
+    <w:p>
+      <w:pPr>
+        <w:spacing w:before="240" w:after="0"/>
+      </w:pPr>
+      <w:r>
+        <w:rPr>
+          <w:b w:val="1"/>
+          <w:bCs w:val="1"/>
+          <w:i w:val="1"/>
+          <w:iCs w:val="1"/>
+          <w:color w:val="1F497D"/>
+        </w:rPr>
+        <w:t xml:space="preserve">Admin version (legal assistant, paralegal and case manager posts)</w:t>
       </w:r>
     </w:p>
     <w:p>
@@ -1388,7 +1432,7 @@
           <w:i w:val="1"/>
           <w:iCs w:val="1"/>
         </w:rPr>
-        <w:t xml:space="preserve">Last message from me, </w:t>
+        <w:t xml:space="preserve">Thanks for connecting, </w:t>
       </w:r>
       <w:r>
         <w:rPr>
@@ -1405,7 +1449,24 @@
           <w:i w:val="1"/>
           <w:iCs w:val="1"/>
         </w:rPr>
-        <w:t xml:space="preserve">. If the </w:t>
+        <w:t xml:space="preserve">. I saw </w:t>
+      </w:r>
+      <w:r>
+        <w:rPr>
+          <w:b w:val="1"/>
+          <w:bCs w:val="1"/>
+          <w:i w:val="1"/>
+          <w:iCs w:val="1"/>
+          <w:color w:val="FF9900"/>
+        </w:rPr>
+        <w:t xml:space="preserve">{company name}</w:t>
+      </w:r>
+      <w:r>
+        <w:rPr>
+          <w:i w:val="1"/>
+          <w:iCs w:val="1"/>
+        </w:rPr>
+        <w:t xml:space="preserve"> is hiring a </w:t>
       </w:r>
       <w:r>
         <w:rPr>
@@ -1422,17 +1483,7 @@
           <w:i w:val="1"/>
           <w:iCs w:val="1"/>
         </w:rPr>
-        <w:t xml:space="preserve"> role is filled, no problem. Some of our biggest client teams started with a single hire, and if a hire isn't the right fit, we replace them at no extra cost. If it's ever useful, you can grab a time with me here: </w:t>
-      </w:r>
-      <w:r>
-        <w:rPr>
-          <w:b w:val="1"/>
-          <w:bCs w:val="1"/>
-          <w:i w:val="1"/>
-          <w:iCs w:val="1"/>
-          <w:color w:val="FF9900"/>
-        </w:rPr>
-        <w:t xml:space="preserve">{booking link}</w:t>
+        <w:t xml:space="preserve">. Clio found lawyers bill on average about 3 hours of an eight-hour day. Is this hire meant to take more of the admin off the attorneys?</w:t>
       </w:r>
     </w:p>
     <w:p>
@@ -1447,7 +1498,442 @@
           <w:sz w:val="22"/>
           <w:szCs w:val="22"/>
         </w:rPr>
-        <w:t xml:space="preserve">Response suggestion: if there's no reply, they leave the sequence. We don't contact them again unless they post a new admin role.</w:t>
+        <w:t xml:space="preserve">Response suggestion: if they're planning more hires, ask which roles come next. If it's intake, ask what happens to calls today when nobody picks up. If it's attorney support, ask where the attorneys lose the most time. Every answer leads into message 2.</w:t>
+      </w:r>
+    </w:p>
+    <w:p>
+      <w:pPr>
+        <w:pStyle w:val="Heading4"/>
+      </w:pPr>
+      <w:r>
+        <w:rPr/>
+        <w:t xml:space="preserve">2</w:t>
+      </w:r>
+      <w:r>
+        <w:rPr>
+          <w:vertAlign w:val="superscript"/>
+        </w:rPr>
+        <w:t xml:space="preserve">nd</w:t>
+      </w:r>
+      <w:r>
+        <w:rPr/>
+        <w:t xml:space="preserve"> Follow-up (3 days after the previous message)</w:t>
+      </w:r>
+    </w:p>
+    <w:p>
+      <w:r>
+        <w:rPr/>
+        <w:t xml:space="preserve">If there's no reply, we introduce ourselves and put the cost side by side: what this role usually costs locally, and what a dedicated remote hire costs with Remote CoWorker.</w:t>
+      </w:r>
+    </w:p>
+    <w:p>
+      <w:pPr>
+        <w:spacing w:before="240" w:after="0"/>
+      </w:pPr>
+      <w:r>
+        <w:rPr>
+          <w:b w:val="1"/>
+          <w:bCs w:val="1"/>
+          <w:i w:val="1"/>
+          <w:iCs w:val="1"/>
+          <w:color w:val="1F497D"/>
+        </w:rPr>
+        <w:t xml:space="preserve">VA version</w:t>
+      </w:r>
+    </w:p>
+    <w:p>
+      <w:pPr>
+        <w:pBdr>
+          <w:top w:color="4f81bd" w:space="10" w:sz="4" w:val="single"/>
+          <w:bottom w:color="4f81bd" w:space="10" w:sz="4" w:val="single"/>
+        </w:pBdr>
+        <w:spacing w:after="240" w:before="240" w:line="240" w:lineRule="auto"/>
+        <w:ind w:left="720"/>
+        <w:jc w:val="left"/>
+      </w:pPr>
+      <w:r>
+        <w:rPr>
+          <w:i w:val="1"/>
+          <w:iCs w:val="1"/>
+        </w:rPr>
+        <w:t xml:space="preserve">I should have introduced myself, </w:t>
+      </w:r>
+      <w:r>
+        <w:rPr>
+          <w:b w:val="1"/>
+          <w:bCs w:val="1"/>
+          <w:i w:val="1"/>
+          <w:iCs w:val="1"/>
+          <w:color w:val="FF9900"/>
+        </w:rPr>
+        <w:t xml:space="preserve">[First Name]</w:t>
+      </w:r>
+      <w:r>
+        <w:rPr>
+          <w:i w:val="1"/>
+          <w:iCs w:val="1"/>
+        </w:rPr>
+        <w:t xml:space="preserve">. I'm Ryan from Remote CoWorker. Hiring a remote assistant yourself means doing the screening, payroll and IT, and starting over when someone leaves. We take all of that on, from $7.99 an hour, and you still interview every candidate. We place receptionists, intake staff, legal assistants and paralegals with US law firms. Would it make sense to look at the </w:t>
+      </w:r>
+      <w:r>
+        <w:rPr>
+          <w:b w:val="1"/>
+          <w:bCs w:val="1"/>
+          <w:i w:val="1"/>
+          <w:iCs w:val="1"/>
+          <w:color w:val="FF9900"/>
+        </w:rPr>
+        <w:t xml:space="preserve">{job title}</w:t>
+      </w:r>
+      <w:r>
+        <w:rPr>
+          <w:i w:val="1"/>
+          <w:iCs w:val="1"/>
+        </w:rPr>
+        <w:t xml:space="preserve"> role this way?</w:t>
+      </w:r>
+    </w:p>
+    <w:p>
+      <w:pPr>
+        <w:spacing w:before="240" w:after="0"/>
+      </w:pPr>
+      <w:r>
+        <w:rPr>
+          <w:b w:val="1"/>
+          <w:bCs w:val="1"/>
+          <w:i w:val="1"/>
+          <w:iCs w:val="1"/>
+          <w:color w:val="1F497D"/>
+        </w:rPr>
+        <w:t xml:space="preserve">Admin version (intake, receptionist and legal assistant posts)</w:t>
+      </w:r>
+    </w:p>
+    <w:p>
+      <w:pPr>
+        <w:pBdr>
+          <w:top w:color="4f81bd" w:space="10" w:sz="4" w:val="single"/>
+          <w:bottom w:color="4f81bd" w:space="10" w:sz="4" w:val="single"/>
+        </w:pBdr>
+        <w:spacing w:after="240" w:before="240" w:line="240" w:lineRule="auto"/>
+        <w:ind w:left="720"/>
+        <w:jc w:val="left"/>
+      </w:pPr>
+      <w:r>
+        <w:rPr>
+          <w:i w:val="1"/>
+          <w:iCs w:val="1"/>
+        </w:rPr>
+        <w:t xml:space="preserve">I should have introduced myself, </w:t>
+      </w:r>
+      <w:r>
+        <w:rPr>
+          <w:b w:val="1"/>
+          <w:bCs w:val="1"/>
+          <w:i w:val="1"/>
+          <w:iCs w:val="1"/>
+          <w:color w:val="FF9900"/>
+        </w:rPr>
+        <w:t xml:space="preserve">[First Name]</w:t>
+      </w:r>
+      <w:r>
+        <w:rPr>
+          <w:i w:val="1"/>
+          <w:iCs w:val="1"/>
+        </w:rPr>
+        <w:t xml:space="preserve">. I'm Ryan from Remote CoWorker. A local legal secretary earns a median $55,570 a year before benefits. A full-time remote hire with us starts at $7.99 an hour, about $16,600 a year, with recruiting, HR, payroll and IT included. Would it make sense to look at the </w:t>
+      </w:r>
+      <w:r>
+        <w:rPr>
+          <w:b w:val="1"/>
+          <w:bCs w:val="1"/>
+          <w:i w:val="1"/>
+          <w:iCs w:val="1"/>
+          <w:color w:val="FF9900"/>
+        </w:rPr>
+        <w:t xml:space="preserve">{job title}</w:t>
+      </w:r>
+      <w:r>
+        <w:rPr>
+          <w:i w:val="1"/>
+          <w:iCs w:val="1"/>
+        </w:rPr>
+        <w:t xml:space="preserve"> role this way?</w:t>
+      </w:r>
+    </w:p>
+    <w:p>
+      <w:pPr>
+        <w:spacing w:before="240" w:after="0"/>
+      </w:pPr>
+      <w:r>
+        <w:rPr>
+          <w:b w:val="1"/>
+          <w:bCs w:val="1"/>
+          <w:i w:val="1"/>
+          <w:iCs w:val="1"/>
+          <w:color w:val="1F497D"/>
+        </w:rPr>
+        <w:t xml:space="preserve">Admin version (paralegal and case manager posts)</w:t>
+      </w:r>
+    </w:p>
+    <w:p>
+      <w:pPr>
+        <w:pBdr>
+          <w:top w:color="4f81bd" w:space="10" w:sz="4" w:val="single"/>
+          <w:bottom w:color="4f81bd" w:space="10" w:sz="4" w:val="single"/>
+        </w:pBdr>
+        <w:spacing w:after="240" w:before="240" w:line="240" w:lineRule="auto"/>
+        <w:ind w:left="720"/>
+        <w:jc w:val="left"/>
+      </w:pPr>
+      <w:r>
+        <w:rPr>
+          <w:i w:val="1"/>
+          <w:iCs w:val="1"/>
+        </w:rPr>
+        <w:t xml:space="preserve">I should have introduced myself, </w:t>
+      </w:r>
+      <w:r>
+        <w:rPr>
+          <w:b w:val="1"/>
+          <w:bCs w:val="1"/>
+          <w:i w:val="1"/>
+          <w:iCs w:val="1"/>
+          <w:color w:val="FF9900"/>
+        </w:rPr>
+        <w:t xml:space="preserve">[First Name]</w:t>
+      </w:r>
+      <w:r>
+        <w:rPr>
+          <w:i w:val="1"/>
+          <w:iCs w:val="1"/>
+        </w:rPr>
+        <w:t xml:space="preserve">. I'm Ryan from Remote CoWorker. A local paralegal earns a median $62,890 a year before benefits. A full-time remote hire with us starts at $7.99 an hour, about $16,600 a year, with recruiting, HR, payroll and IT included. Would it make sense to look at the </w:t>
+      </w:r>
+      <w:r>
+        <w:rPr>
+          <w:b w:val="1"/>
+          <w:bCs w:val="1"/>
+          <w:i w:val="1"/>
+          <w:iCs w:val="1"/>
+          <w:color w:val="FF9900"/>
+        </w:rPr>
+        <w:t xml:space="preserve">{job title}</w:t>
+      </w:r>
+      <w:r>
+        <w:rPr>
+          <w:i w:val="1"/>
+          <w:iCs w:val="1"/>
+        </w:rPr>
+        <w:t xml:space="preserve"> role this way?</w:t>
+      </w:r>
+    </w:p>
+    <w:p>
+      <w:pPr>
+        <w:spacing w:before="60" w:after="120"/>
+      </w:pPr>
+      <w:r>
+        <w:rPr>
+          <w:i w:val="1"/>
+          <w:iCs w:val="1"/>
+          <w:color w:val="404040"/>
+          <w:sz w:val="22"/>
+          <w:szCs w:val="22"/>
+        </w:rPr>
+        <w:t xml:space="preserve">Response suggestion: if a firm administrator asks about supervision (ABA Model Rule 5.3 makes lawyers responsible for supervising non-lawyer staff), explain the Accountability Manager and the work analytics software. Don't mention security certifications until Gidon confirms them for legal.</w:t>
+      </w:r>
+    </w:p>
+    <w:p>
+      <w:pPr>
+        <w:pStyle w:val="Heading4"/>
+      </w:pPr>
+      <w:r>
+        <w:rPr/>
+        <w:t xml:space="preserve">3</w:t>
+      </w:r>
+      <w:r>
+        <w:rPr>
+          <w:vertAlign w:val="superscript"/>
+        </w:rPr>
+        <w:t xml:space="preserve">rd</w:t>
+      </w:r>
+      <w:r>
+        <w:rPr/>
+        <w:t xml:space="preserve"> Follow-up (3 days after the previous message)</w:t>
+      </w:r>
+    </w:p>
+    <w:p>
+      <w:r>
+        <w:rPr/>
+        <w:t xml:space="preserve">Proof from a real client, and the free consultation as the next step.</w:t>
+      </w:r>
+    </w:p>
+    <w:p>
+      <w:pPr>
+        <w:pBdr>
+          <w:top w:color="4f81bd" w:space="10" w:sz="4" w:val="single"/>
+          <w:bottom w:color="4f81bd" w:space="10" w:sz="4" w:val="single"/>
+        </w:pBdr>
+        <w:spacing w:after="240" w:before="240" w:line="240" w:lineRule="auto"/>
+        <w:ind w:left="720"/>
+        <w:jc w:val="left"/>
+      </w:pPr>
+      <w:r>
+        <w:rPr>
+          <w:i w:val="1"/>
+          <w:iCs w:val="1"/>
+        </w:rPr>
+        <w:t xml:space="preserve">One example, </w:t>
+      </w:r>
+      <w:r>
+        <w:rPr>
+          <w:b w:val="1"/>
+          <w:bCs w:val="1"/>
+          <w:i w:val="1"/>
+          <w:iCs w:val="1"/>
+          <w:color w:val="FF9900"/>
+        </w:rPr>
+        <w:t xml:space="preserve">[First Name]</w:t>
+      </w:r>
+      <w:r>
+        <w:rPr>
+          <w:i w:val="1"/>
+          <w:iCs w:val="1"/>
+        </w:rPr>
+        <w:t xml:space="preserve">. A California law firm started with one remote intake manager. Three years later, they have 17 remote staff across reception, intake, auditing, accounting and marketing, and several have been with them for over three years. You interview every candidate before committing. Happy to do a free call to map out the </w:t>
+      </w:r>
+      <w:r>
+        <w:rPr>
+          <w:b w:val="1"/>
+          <w:bCs w:val="1"/>
+          <w:i w:val="1"/>
+          <w:iCs w:val="1"/>
+          <w:color w:val="FF9900"/>
+        </w:rPr>
+        <w:t xml:space="preserve">{job title}</w:t>
+      </w:r>
+      <w:r>
+        <w:rPr>
+          <w:i w:val="1"/>
+          <w:iCs w:val="1"/>
+        </w:rPr>
+        <w:t xml:space="preserve"> role and what it would cost. Would next week work?</w:t>
+      </w:r>
+    </w:p>
+    <w:p>
+      <w:pPr>
+        <w:spacing w:before="60" w:after="120"/>
+      </w:pPr>
+      <w:r>
+        <w:rPr>
+          <w:i w:val="1"/>
+          <w:iCs w:val="1"/>
+          <w:color w:val="404040"/>
+          <w:sz w:val="22"/>
+          <w:szCs w:val="22"/>
+        </w:rPr>
+        <w:t xml:space="preserve">Response suggestion: if they say yes, book the call in Ryan's calendar. If they're interested but not ready, offer $300 off the first month as a reason to start with one hire.</w:t>
+      </w:r>
+    </w:p>
+    <w:p>
+      <w:pPr>
+        <w:pStyle w:val="Heading4"/>
+      </w:pPr>
+      <w:r>
+        <w:rPr/>
+        <w:t xml:space="preserve">4</w:t>
+      </w:r>
+      <w:r>
+        <w:rPr>
+          <w:vertAlign w:val="superscript"/>
+        </w:rPr>
+        <w:t xml:space="preserve">th</w:t>
+      </w:r>
+      <w:r>
+        <w:rPr/>
+        <w:t xml:space="preserve"> Follow-up (4 days after the previous message)</w:t>
+      </w:r>
+    </w:p>
+    <w:p>
+      <w:r>
+        <w:rPr/>
+        <w:t xml:space="preserve">The last message. It keeps the door open, even if the role has been filled, and gives a direct link to book a call.</w:t>
+      </w:r>
+    </w:p>
+    <w:p>
+      <w:pPr>
+        <w:pBdr>
+          <w:top w:color="4f81bd" w:space="10" w:sz="4" w:val="single"/>
+          <w:bottom w:color="4f81bd" w:space="10" w:sz="4" w:val="single"/>
+        </w:pBdr>
+        <w:spacing w:after="240" w:before="240" w:line="240" w:lineRule="auto"/>
+        <w:ind w:left="720"/>
+        <w:jc w:val="left"/>
+      </w:pPr>
+      <w:r>
+        <w:rPr>
+          <w:i w:val="1"/>
+          <w:iCs w:val="1"/>
+        </w:rPr>
+        <w:t xml:space="preserve">Last message from me, </w:t>
+      </w:r>
+      <w:r>
+        <w:rPr>
+          <w:b w:val="1"/>
+          <w:bCs w:val="1"/>
+          <w:i w:val="1"/>
+          <w:iCs w:val="1"/>
+          <w:color w:val="FF9900"/>
+        </w:rPr>
+        <w:t xml:space="preserve">[First Name]</w:t>
+      </w:r>
+      <w:r>
+        <w:rPr>
+          <w:i w:val="1"/>
+          <w:iCs w:val="1"/>
+        </w:rPr>
+        <w:t xml:space="preserve">. If the </w:t>
+      </w:r>
+      <w:r>
+        <w:rPr>
+          <w:b w:val="1"/>
+          <w:bCs w:val="1"/>
+          <w:i w:val="1"/>
+          <w:iCs w:val="1"/>
+          <w:color w:val="FF9900"/>
+        </w:rPr>
+        <w:t xml:space="preserve">{job title}</w:t>
+      </w:r>
+      <w:r>
+        <w:rPr>
+          <w:i w:val="1"/>
+          <w:iCs w:val="1"/>
+        </w:rPr>
+        <w:t xml:space="preserve"> role is still open, our clients usually have their hire in place within one to three weeks, and if someone isn't the right fit, we replace them at no extra cost. If it's useful, you can pick a time with me here: </w:t>
+      </w:r>
+      <w:r>
+        <w:rPr>
+          <w:b w:val="1"/>
+          <w:bCs w:val="1"/>
+          <w:i w:val="1"/>
+          <w:iCs w:val="1"/>
+          <w:color w:val="FF9900"/>
+        </w:rPr>
+        <w:t xml:space="preserve">{booking link}</w:t>
+      </w:r>
+    </w:p>
+    <w:p>
+      <w:pPr>
+        <w:spacing w:before="60" w:after="120"/>
+      </w:pPr>
+      <w:r>
+        <w:rPr>
+          <w:i w:val="1"/>
+          <w:iCs w:val="1"/>
+          <w:color w:val="404040"/>
+          <w:sz w:val="22"/>
+          <w:szCs w:val="22"/>
+        </w:rPr>
+        <w:t xml:space="preserve">Response suggestion: if the role has been filled, ask whether more support hires are coming this year, and stay in touch. If there's no reply, they leave the sequence until they post a new role.</w:t>
       </w:r>
     </w:p>
     <w:p>

</xml_diff>

<commit_message>
Align Remote CoWorker message versions with the LinkedIn Jobs searches
Co-Authored-By: Claude Opus 5.5 <noreply@anthropic.com>
Claude-Session: https://claude.ai/code/session_01Lr1syY3hkLeZYJhtN2s4Rg
</commit_message>
<xml_diff>
--- a/Outreach Messages - Remote CoWorker.docx
+++ b/Outreach Messages - Remote CoWorker.docx
@@ -182,7 +182,7 @@
       </w:r>
       <w:r>
         <w:rPr/>
-        <w:t xml:space="preserve"> front desk, scheduling, billing, coding, prior authorization, insurance verification or scribe for ICP 1; reception, intake, legal assistant, paralegal or case manager for ICP 2. Only 8.6% of US job posts mention remote work, so this is the larger pool. The question is local hire versus a remote one.</w:t>
+        <w:t xml:space="preserve"> front desk, scheduling, billing, coding, prior authorization, insurance verification or scribe for ICP 1; reception, intake, legal assistant, legal secretary, paralegal or case manager for ICP 2. Only 8.6% of US job posts mention remote work, so this is the larger pool. The question is local hire versus a remote one.</w:t>
       </w:r>
     </w:p>
     <w:p>
@@ -257,6 +257,12 @@
     <w:p>
       <w:r>
         <w:rPr/>
+        <w:t xml:space="preserve">Each LinkedIn Jobs search in the ICP research feeds one message version: searches 1a and 1b (virtual assistant posts) get the VA version; searches 2a, 2b and 3a to 3c (admin posts) get the matching admin version. The labels above each message show which search it belongs to.</w:t>
+      </w:r>
+    </w:p>
+    <w:p>
+      <w:r>
+        <w:rPr/>
         <w:t xml:space="preserve">Messages 1 and 2 have a version for each kind of post: the </w:t>
       </w:r>
       <w:r>
@@ -445,7 +451,7 @@
     <w:p>
       <w:r>
         <w:rPr/>
-        <w:t xml:space="preserve">Sent one day after they accept. It mentions the role they're hiring for and one fact about that kind of hire, and ends with an easy question. No pitch yet: the goal is a reply.</w:t>
+        <w:t xml:space="preserve">Sent one day after they accept. It mentions the role they're hiring for (and, in the admin versions, one fact about that kind of hire), and ends with an easy question. No pitch yet: the goal is a reply.</w:t>
       </w:r>
     </w:p>
     <w:p>
@@ -460,7 +466,7 @@
           <w:iCs w:val="1"/>
           <w:color w:val="1F497D"/>
         </w:rPr>
-        <w:t xml:space="preserve">VA version</w:t>
+        <w:t xml:space="preserve">VA version (search 1a)</w:t>
       </w:r>
     </w:p>
     <w:p>
@@ -544,7 +550,7 @@
           <w:iCs w:val="1"/>
           <w:color w:val="1F497D"/>
         </w:rPr>
-        <w:t xml:space="preserve">Admin version (front desk, scheduling, scribe and other admin posts)</w:t>
+        <w:t xml:space="preserve">Admin version, front desk (search 2a)</w:t>
       </w:r>
     </w:p>
     <w:p>
@@ -628,7 +634,7 @@
           <w:iCs w:val="1"/>
           <w:color w:val="1F497D"/>
         </w:rPr>
-        <w:t xml:space="preserve">Admin version (prior authorization, billing and insurance verification posts)</w:t>
+        <w:t xml:space="preserve">Admin version, billing and prior authorization (search 2b)</w:t>
       </w:r>
     </w:p>
     <w:p>
@@ -752,7 +758,7 @@
           <w:iCs w:val="1"/>
           <w:color w:val="1F497D"/>
         </w:rPr>
-        <w:t xml:space="preserve">VA version</w:t>
+        <w:t xml:space="preserve">VA version (search 1a)</w:t>
       </w:r>
     </w:p>
     <w:p>
@@ -819,7 +825,7 @@
           <w:iCs w:val="1"/>
           <w:color w:val="1F497D"/>
         </w:rPr>
-        <w:t xml:space="preserve">Admin version</w:t>
+        <w:t xml:space="preserve">Admin version, front desk (search 2a)</w:t>
       </w:r>
     </w:p>
     <w:p>
@@ -876,42 +882,17 @@
     </w:p>
     <w:p>
       <w:pPr>
-        <w:spacing w:before="60" w:after="120"/>
-      </w:pPr>
-      <w:r>
-        <w:rPr>
-          <w:i w:val="1"/>
-          <w:iCs w:val="1"/>
-          <w:color w:val="404040"/>
-          <w:sz w:val="22"/>
-          <w:szCs w:val="22"/>
-        </w:rPr>
-        <w:t xml:space="preserve">Response suggestion: if they ask about patient data, the website lists HIPAA compliance, ISO 27001 and SOC 2; confirm the details with Gidon before going further. If they say the role has to be on-site, ask which parts could be done remotely, such as calls, scheduling, insurance checks or billing.</w:t>
-      </w:r>
-    </w:p>
-    <w:p>
-      <w:pPr>
-        <w:pStyle w:val="Heading4"/>
-      </w:pPr>
-      <w:r>
-        <w:rPr/>
-        <w:t xml:space="preserve">3</w:t>
-      </w:r>
-      <w:r>
-        <w:rPr>
-          <w:vertAlign w:val="superscript"/>
-        </w:rPr>
-        <w:t xml:space="preserve">rd</w:t>
-      </w:r>
-      <w:r>
-        <w:rPr/>
-        <w:t xml:space="preserve"> Follow-up (3 days after the previous message)</w:t>
-      </w:r>
-    </w:p>
-    <w:p>
-      <w:r>
-        <w:rPr/>
-        <w:t xml:space="preserve">Proof from a real client, and the free consultation as the next step.</w:t>
+        <w:spacing w:before="240" w:after="0"/>
+      </w:pPr>
+      <w:r>
+        <w:rPr>
+          <w:b w:val="1"/>
+          <w:bCs w:val="1"/>
+          <w:i w:val="1"/>
+          <w:iCs w:val="1"/>
+          <w:color w:val="1F497D"/>
+        </w:rPr>
+        <w:t xml:space="preserve">Admin version, billing and prior authorization (search 2b)</w:t>
       </w:r>
     </w:p>
     <w:p>
@@ -929,7 +910,7 @@
           <w:i w:val="1"/>
           <w:iCs w:val="1"/>
         </w:rPr>
-        <w:t xml:space="preserve">One example, </w:t>
+        <w:t xml:space="preserve">I should have introduced myself, </w:t>
       </w:r>
       <w:r>
         <w:rPr>
@@ -946,7 +927,7 @@
           <w:i w:val="1"/>
           <w:iCs w:val="1"/>
         </w:rPr>
-        <w:t xml:space="preserve">. An optometry practice in Michigan has had a 6 to 10 person remote team with us since September 2025, handling patient calls, scheduling and fee collection. They've seen higher call rates and completed collections. You interview every candidate before committing, and each hire has an Accountability Manager, so you see the work without managing every detail. Happy to do a free call to map out the </w:t>
+        <w:t xml:space="preserve">. I'm Nelus, Director of Business Development at Remote CoWorker. 40% of physicians now have staff who work only on prior authorizations, according to the AMA. Our people already handle insurance verification, billing and coding for US practices, and a full-time remote hire with us starts at $7.99 an hour, about $16,600 a year, with recruiting, HR, payroll and IT included. Would it make sense to look at the </w:t>
       </w:r>
       <w:r>
         <w:rPr>
@@ -963,7 +944,7 @@
           <w:i w:val="1"/>
           <w:iCs w:val="1"/>
         </w:rPr>
-        <w:t xml:space="preserve"> role and what it would cost. Would next week work?</w:t>
+        <w:t xml:space="preserve"> role this way?</w:t>
       </w:r>
     </w:p>
     <w:p>
@@ -978,7 +959,7 @@
           <w:sz w:val="22"/>
           <w:szCs w:val="22"/>
         </w:rPr>
-        <w:t xml:space="preserve">Response suggestion: if they say yes, book the call in Nelus's calendar. If they're interested but not ready, offer $300 off the first month as a reason to start with one hire.</w:t>
+        <w:t xml:space="preserve">Response suggestion: if they ask about patient data, the website lists HIPAA compliance, ISO 27001 and SOC 2; confirm the details with Gidon before going further. If they say the role has to be on-site, ask which parts could be done remotely, such as calls, scheduling, insurance checks or billing.</w:t>
       </w:r>
     </w:p>
     <w:p>
@@ -987,23 +968,23 @@
       </w:pPr>
       <w:r>
         <w:rPr/>
-        <w:t xml:space="preserve">4</w:t>
+        <w:t xml:space="preserve">3</w:t>
       </w:r>
       <w:r>
         <w:rPr>
           <w:vertAlign w:val="superscript"/>
         </w:rPr>
-        <w:t xml:space="preserve">th</w:t>
-      </w:r>
-      <w:r>
-        <w:rPr/>
-        <w:t xml:space="preserve"> Follow-up (4 days after the previous message)</w:t>
-      </w:r>
-    </w:p>
-    <w:p>
-      <w:r>
-        <w:rPr/>
-        <w:t xml:space="preserve">The last message. It keeps the door open, even if the role has been filled, and gives a direct link to book a call.</w:t>
+        <w:t xml:space="preserve">rd</w:t>
+      </w:r>
+      <w:r>
+        <w:rPr/>
+        <w:t xml:space="preserve"> Follow-up (3 days after the previous message)</w:t>
+      </w:r>
+    </w:p>
+    <w:p>
+      <w:r>
+        <w:rPr/>
+        <w:t xml:space="preserve">Proof from a real client, and the free consultation as the next step.</w:t>
       </w:r>
     </w:p>
     <w:p>
@@ -1021,7 +1002,7 @@
           <w:i w:val="1"/>
           <w:iCs w:val="1"/>
         </w:rPr>
-        <w:t xml:space="preserve">Last message from me, </w:t>
+        <w:t xml:space="preserve">One example, </w:t>
       </w:r>
       <w:r>
         <w:rPr>
@@ -1038,7 +1019,7 @@
           <w:i w:val="1"/>
           <w:iCs w:val="1"/>
         </w:rPr>
-        <w:t xml:space="preserve">. If the </w:t>
+        <w:t xml:space="preserve">. An optometry practice in Michigan has had a 6 to 10 person remote team with us since September 2025, handling patient calls, scheduling and fee collection. They've seen higher call rates and completed collections. You interview every candidate before committing, and each hire has an Accountability Manager, so you see the work without managing every detail. Happy to do a free call to map out the </w:t>
       </w:r>
       <w:r>
         <w:rPr>
@@ -1055,17 +1036,7 @@
           <w:i w:val="1"/>
           <w:iCs w:val="1"/>
         </w:rPr>
-        <w:t xml:space="preserve"> role is still open, our clients usually have their hire in place within one to three weeks, and if someone isn't the right fit, we replace them at no extra cost. If it's useful, you can pick a time with me here: </w:t>
-      </w:r>
-      <w:r>
-        <w:rPr>
-          <w:b w:val="1"/>
-          <w:bCs w:val="1"/>
-          <w:i w:val="1"/>
-          <w:iCs w:val="1"/>
-          <w:color w:val="FF9900"/>
-        </w:rPr>
-        <w:t xml:space="preserve">{booking link}</w:t>
+        <w:t xml:space="preserve"> role and what it would cost. Would next week work?</w:t>
       </w:r>
     </w:p>
     <w:p>
@@ -1080,133 +1051,7 @@
           <w:sz w:val="22"/>
           <w:szCs w:val="22"/>
         </w:rPr>
-        <w:t xml:space="preserve">Response suggestion: if the role has been filled, ask whether more admin hires are coming this year, and stay in touch. If there's no reply, they leave the sequence until they post a new role.</w:t>
-      </w:r>
-    </w:p>
-    <w:p>
-      <w:pPr>
-        <w:pStyle w:val="Heading2"/>
-      </w:pPr>
-      <w:r>
-        <w:rPr/>
-        <w:t xml:space="preserve">Ryan — ICP 2: Consumer-Facing Law Firms</w:t>
-      </w:r>
-    </w:p>
-    <w:p>
-      <w:pPr>
-        <w:pStyle w:val="Heading3"/>
-      </w:pPr>
-      <w:r>
-        <w:rPr/>
-        <w:t xml:space="preserve">Connection Request</w:t>
-      </w:r>
-    </w:p>
-    <w:p>
-      <w:r>
-        <w:rPr/>
-        <w:t xml:space="preserve">The same approach as for ICP 1:</w:t>
-      </w:r>
-    </w:p>
-    <w:p>
-      <w:pPr>
-        <w:numPr>
-          <w:ilvl w:val="0"/>
-          <w:numId w:val="1"/>
-        </w:numPr>
-        <w:spacing w:after="0" w:before="60" w:line="240" w:lineRule="auto"/>
-        <w:ind w:left="1584" w:right="864" w:hanging="360"/>
-      </w:pPr>
-      <w:r>
-        <w:rPr>
-          <w:i w:val="1"/>
-          <w:iCs w:val="1"/>
-        </w:rPr>
-        <w:t xml:space="preserve">Hi </w:t>
-      </w:r>
-      <w:r>
-        <w:rPr>
-          <w:b w:val="1"/>
-          <w:bCs w:val="1"/>
-          <w:i w:val="1"/>
-          <w:iCs w:val="1"/>
-          <w:color w:val="FF9900"/>
-        </w:rPr>
-        <w:t xml:space="preserve">[First Name]</w:t>
-      </w:r>
-      <w:r>
-        <w:rPr>
-          <w:i w:val="1"/>
-          <w:iCs w:val="1"/>
-        </w:rPr>
-        <w:t xml:space="preserve">, I'd love to connect.</w:t>
-      </w:r>
-    </w:p>
-    <w:p>
-      <w:pPr>
-        <w:numPr>
-          <w:ilvl w:val="0"/>
-          <w:numId w:val="1"/>
-        </w:numPr>
-        <w:spacing w:after="0" w:before="60" w:line="240" w:lineRule="auto"/>
-        <w:ind w:left="1584" w:right="864" w:hanging="360"/>
-      </w:pPr>
-      <w:r>
-        <w:rPr>
-          <w:i w:val="1"/>
-          <w:iCs w:val="1"/>
-        </w:rPr>
-        <w:t xml:space="preserve">Hi </w:t>
-      </w:r>
-      <w:r>
-        <w:rPr>
-          <w:b w:val="1"/>
-          <w:bCs w:val="1"/>
-          <w:i w:val="1"/>
-          <w:iCs w:val="1"/>
-          <w:color w:val="FF9900"/>
-        </w:rPr>
-        <w:t xml:space="preserve">[First Name]</w:t>
-      </w:r>
-      <w:r>
-        <w:rPr>
-          <w:i w:val="1"/>
-          <w:iCs w:val="1"/>
-        </w:rPr>
-        <w:t xml:space="preserve">, I see </w:t>
-      </w:r>
-      <w:r>
-        <w:rPr>
-          <w:b w:val="1"/>
-          <w:bCs w:val="1"/>
-          <w:i w:val="1"/>
-          <w:iCs w:val="1"/>
-          <w:color w:val="FF9900"/>
-        </w:rPr>
-        <w:t xml:space="preserve">{company name}</w:t>
-      </w:r>
-      <w:r>
-        <w:rPr>
-          <w:i w:val="1"/>
-          <w:iCs w:val="1"/>
-        </w:rPr>
-        <w:t xml:space="preserve"> is growing the team. Would be great to connect.</w:t>
-      </w:r>
-    </w:p>
-    <w:p>
-      <w:pPr>
-        <w:numPr>
-          <w:ilvl w:val="0"/>
-          <w:numId w:val="1"/>
-        </w:numPr>
-        <w:spacing w:after="0" w:before="60" w:line="240" w:lineRule="auto"/>
-        <w:ind w:left="1584" w:right="864" w:hanging="360"/>
-      </w:pPr>
-      <w:r>
-        <w:rPr>
-          <w:i w:val="1"/>
-          <w:iCs w:val="1"/>
-        </w:rPr>
-        <w:t xml:space="preserve">Blank invitation</w:t>
+        <w:t xml:space="preserve">Response suggestion: if they say yes, book the call in Nelus's calendar. If they're interested but not ready, offer $300 off the first month as a reason to start with one hire.</w:t>
       </w:r>
     </w:p>
     <w:p>
@@ -1215,38 +1060,23 @@
       </w:pPr>
       <w:r>
         <w:rPr/>
-        <w:t xml:space="preserve">1</w:t>
+        <w:t xml:space="preserve">4</w:t>
       </w:r>
       <w:r>
         <w:rPr>
           <w:vertAlign w:val="superscript"/>
         </w:rPr>
-        <w:t xml:space="preserve">st</w:t>
-      </w:r>
-      <w:r>
-        <w:rPr/>
-        <w:t xml:space="preserve"> Follow-up (1 day after they accept)</w:t>
-      </w:r>
-    </w:p>
-    <w:p>
-      <w:r>
-        <w:rPr/>
-        <w:t xml:space="preserve">Sent one day after they accept. It mentions the role they're hiring for and one fact about that kind of hire, and ends with an easy question. No pitch yet: the goal is a reply.</w:t>
-      </w:r>
-    </w:p>
-    <w:p>
-      <w:pPr>
-        <w:spacing w:before="240" w:after="0"/>
-      </w:pPr>
-      <w:r>
-        <w:rPr>
-          <w:b w:val="1"/>
-          <w:bCs w:val="1"/>
-          <w:i w:val="1"/>
-          <w:iCs w:val="1"/>
-          <w:color w:val="1F497D"/>
-        </w:rPr>
-        <w:t xml:space="preserve">VA version</w:t>
+        <w:t xml:space="preserve">th</w:t>
+      </w:r>
+      <w:r>
+        <w:rPr/>
+        <w:t xml:space="preserve"> Follow-up (4 days after the previous message)</w:t>
+      </w:r>
+    </w:p>
+    <w:p>
+      <w:r>
+        <w:rPr/>
+        <w:t xml:space="preserve">The last message. It keeps the door open, even if the role has been filled, and gives a direct link to book a call.</w:t>
       </w:r>
     </w:p>
     <w:p>
@@ -1264,7 +1094,7 @@
           <w:i w:val="1"/>
           <w:iCs w:val="1"/>
         </w:rPr>
-        <w:t xml:space="preserve">Thanks for connecting, </w:t>
+        <w:t xml:space="preserve">Last message from me, </w:t>
       </w:r>
       <w:r>
         <w:rPr>
@@ -1281,7 +1111,141 @@
           <w:i w:val="1"/>
           <w:iCs w:val="1"/>
         </w:rPr>
-        <w:t xml:space="preserve">. I saw </w:t>
+        <w:t xml:space="preserve">. If the </w:t>
+      </w:r>
+      <w:r>
+        <w:rPr>
+          <w:b w:val="1"/>
+          <w:bCs w:val="1"/>
+          <w:i w:val="1"/>
+          <w:iCs w:val="1"/>
+          <w:color w:val="FF9900"/>
+        </w:rPr>
+        <w:t xml:space="preserve">{job title}</w:t>
+      </w:r>
+      <w:r>
+        <w:rPr>
+          <w:i w:val="1"/>
+          <w:iCs w:val="1"/>
+        </w:rPr>
+        <w:t xml:space="preserve"> role is still open, our clients usually have their hire in place within one to three weeks, and if someone isn't the right fit, we replace them at no extra cost. If it's useful, you can pick a time with me here: </w:t>
+      </w:r>
+      <w:r>
+        <w:rPr>
+          <w:b w:val="1"/>
+          <w:bCs w:val="1"/>
+          <w:i w:val="1"/>
+          <w:iCs w:val="1"/>
+          <w:color w:val="FF9900"/>
+        </w:rPr>
+        <w:t xml:space="preserve">{booking link}</w:t>
+      </w:r>
+    </w:p>
+    <w:p>
+      <w:pPr>
+        <w:spacing w:before="60" w:after="120"/>
+      </w:pPr>
+      <w:r>
+        <w:rPr>
+          <w:i w:val="1"/>
+          <w:iCs w:val="1"/>
+          <w:color w:val="404040"/>
+          <w:sz w:val="22"/>
+          <w:szCs w:val="22"/>
+        </w:rPr>
+        <w:t xml:space="preserve">Response suggestion: if the role has been filled, ask whether more admin hires are coming this year, and stay in touch. If there's no reply, they leave the sequence until they post a new role.</w:t>
+      </w:r>
+    </w:p>
+    <w:p>
+      <w:pPr>
+        <w:pStyle w:val="Heading2"/>
+      </w:pPr>
+      <w:r>
+        <w:rPr/>
+        <w:t xml:space="preserve">Ryan — ICP 2: Consumer-Facing Law Firms</w:t>
+      </w:r>
+    </w:p>
+    <w:p>
+      <w:pPr>
+        <w:pStyle w:val="Heading3"/>
+      </w:pPr>
+      <w:r>
+        <w:rPr/>
+        <w:t xml:space="preserve">Connection Request</w:t>
+      </w:r>
+    </w:p>
+    <w:p>
+      <w:r>
+        <w:rPr/>
+        <w:t xml:space="preserve">The same approach as for ICP 1:</w:t>
+      </w:r>
+    </w:p>
+    <w:p>
+      <w:pPr>
+        <w:numPr>
+          <w:ilvl w:val="0"/>
+          <w:numId w:val="1"/>
+        </w:numPr>
+        <w:spacing w:after="0" w:before="60" w:line="240" w:lineRule="auto"/>
+        <w:ind w:left="1584" w:right="864" w:hanging="360"/>
+      </w:pPr>
+      <w:r>
+        <w:rPr>
+          <w:i w:val="1"/>
+          <w:iCs w:val="1"/>
+        </w:rPr>
+        <w:t xml:space="preserve">Hi </w:t>
+      </w:r>
+      <w:r>
+        <w:rPr>
+          <w:b w:val="1"/>
+          <w:bCs w:val="1"/>
+          <w:i w:val="1"/>
+          <w:iCs w:val="1"/>
+          <w:color w:val="FF9900"/>
+        </w:rPr>
+        <w:t xml:space="preserve">[First Name]</w:t>
+      </w:r>
+      <w:r>
+        <w:rPr>
+          <w:i w:val="1"/>
+          <w:iCs w:val="1"/>
+        </w:rPr>
+        <w:t xml:space="preserve">, I'd love to connect.</w:t>
+      </w:r>
+    </w:p>
+    <w:p>
+      <w:pPr>
+        <w:numPr>
+          <w:ilvl w:val="0"/>
+          <w:numId w:val="1"/>
+        </w:numPr>
+        <w:spacing w:after="0" w:before="60" w:line="240" w:lineRule="auto"/>
+        <w:ind w:left="1584" w:right="864" w:hanging="360"/>
+      </w:pPr>
+      <w:r>
+        <w:rPr>
+          <w:i w:val="1"/>
+          <w:iCs w:val="1"/>
+        </w:rPr>
+        <w:t xml:space="preserve">Hi </w:t>
+      </w:r>
+      <w:r>
+        <w:rPr>
+          <w:b w:val="1"/>
+          <w:bCs w:val="1"/>
+          <w:i w:val="1"/>
+          <w:iCs w:val="1"/>
+          <w:color w:val="FF9900"/>
+        </w:rPr>
+        <w:t xml:space="preserve">[First Name]</w:t>
+      </w:r>
+      <w:r>
+        <w:rPr>
+          <w:i w:val="1"/>
+          <w:iCs w:val="1"/>
+        </w:rPr>
+        <w:t xml:space="preserve">, I see </w:t>
       </w:r>
       <w:r>
         <w:rPr>
@@ -1298,24 +1262,49 @@
           <w:i w:val="1"/>
           <w:iCs w:val="1"/>
         </w:rPr>
-        <w:t xml:space="preserve"> is hiring a </w:t>
-      </w:r>
-      <w:r>
-        <w:rPr>
-          <w:b w:val="1"/>
-          <w:bCs w:val="1"/>
-          <w:i w:val="1"/>
-          <w:iCs w:val="1"/>
-          <w:color w:val="FF9900"/>
-        </w:rPr>
-        <w:t xml:space="preserve">{job title}</w:t>
-      </w:r>
-      <w:r>
-        <w:rPr>
-          <w:i w:val="1"/>
-          <w:iCs w:val="1"/>
-        </w:rPr>
-        <w:t xml:space="preserve">. Is this one person for now, or the start of a bigger remote team?</w:t>
+        <w:t xml:space="preserve"> is growing the team. Would be great to connect.</w:t>
+      </w:r>
+    </w:p>
+    <w:p>
+      <w:pPr>
+        <w:numPr>
+          <w:ilvl w:val="0"/>
+          <w:numId w:val="1"/>
+        </w:numPr>
+        <w:spacing w:after="0" w:before="60" w:line="240" w:lineRule="auto"/>
+        <w:ind w:left="1584" w:right="864" w:hanging="360"/>
+      </w:pPr>
+      <w:r>
+        <w:rPr>
+          <w:i w:val="1"/>
+          <w:iCs w:val="1"/>
+        </w:rPr>
+        <w:t xml:space="preserve">Blank invitation</w:t>
+      </w:r>
+    </w:p>
+    <w:p>
+      <w:pPr>
+        <w:pStyle w:val="Heading4"/>
+      </w:pPr>
+      <w:r>
+        <w:rPr/>
+        <w:t xml:space="preserve">1</w:t>
+      </w:r>
+      <w:r>
+        <w:rPr>
+          <w:vertAlign w:val="superscript"/>
+        </w:rPr>
+        <w:t xml:space="preserve">st</w:t>
+      </w:r>
+      <w:r>
+        <w:rPr/>
+        <w:t xml:space="preserve"> Follow-up (1 day after they accept)</w:t>
+      </w:r>
+    </w:p>
+    <w:p>
+      <w:r>
+        <w:rPr/>
+        <w:t xml:space="preserve">Sent one day after they accept. It mentions the role they're hiring for (and, in the admin versions, one fact about that kind of hire), and ends with an easy question. No pitch yet: the goal is a reply.</w:t>
       </w:r>
     </w:p>
     <w:p>
@@ -1330,7 +1319,7 @@
           <w:iCs w:val="1"/>
           <w:color w:val="1F497D"/>
         </w:rPr>
-        <w:t xml:space="preserve">Admin version (intake and receptionist posts)</w:t>
+        <w:t xml:space="preserve">VA version (search 1b)</w:t>
       </w:r>
     </w:p>
     <w:p>
@@ -1399,7 +1388,7 @@
           <w:i w:val="1"/>
           <w:iCs w:val="1"/>
         </w:rPr>
-        <w:t xml:space="preserve">. In a secret-shopper test of 500 US law firms, only 40% answered the phone. Is this hire meant to make sure every call gets picked up?</w:t>
+        <w:t xml:space="preserve">. Is this one person for now, or the start of a bigger remote team?</w:t>
       </w:r>
     </w:p>
     <w:p>
@@ -1414,7 +1403,7 @@
           <w:iCs w:val="1"/>
           <w:color w:val="1F497D"/>
         </w:rPr>
-        <w:t xml:space="preserve">Admin version (legal assistant, paralegal and case manager posts)</w:t>
+        <w:t xml:space="preserve">Admin version, intake and reception (search 3a)</w:t>
       </w:r>
     </w:p>
     <w:p>
@@ -1483,47 +1472,7 @@
           <w:i w:val="1"/>
           <w:iCs w:val="1"/>
         </w:rPr>
-        <w:t xml:space="preserve">. Clio found lawyers bill on average about 3 hours of an eight-hour day. Is this hire meant to take more of the admin off the attorneys?</w:t>
-      </w:r>
-    </w:p>
-    <w:p>
-      <w:pPr>
-        <w:spacing w:before="60" w:after="120"/>
-      </w:pPr>
-      <w:r>
-        <w:rPr>
-          <w:i w:val="1"/>
-          <w:iCs w:val="1"/>
-          <w:color w:val="404040"/>
-          <w:sz w:val="22"/>
-          <w:szCs w:val="22"/>
-        </w:rPr>
-        <w:t xml:space="preserve">Response suggestion: if they're planning more hires, ask which roles come next. If it's intake, ask what happens to calls today when nobody picks up. If it's attorney support, ask where the attorneys lose the most time. Every answer leads into message 2.</w:t>
-      </w:r>
-    </w:p>
-    <w:p>
-      <w:pPr>
-        <w:pStyle w:val="Heading4"/>
-      </w:pPr>
-      <w:r>
-        <w:rPr/>
-        <w:t xml:space="preserve">2</w:t>
-      </w:r>
-      <w:r>
-        <w:rPr>
-          <w:vertAlign w:val="superscript"/>
-        </w:rPr>
-        <w:t xml:space="preserve">nd</w:t>
-      </w:r>
-      <w:r>
-        <w:rPr/>
-        <w:t xml:space="preserve"> Follow-up (3 days after the previous message)</w:t>
-      </w:r>
-    </w:p>
-    <w:p>
-      <w:r>
-        <w:rPr/>
-        <w:t xml:space="preserve">If there's no reply, we introduce ourselves and put the cost side by side: what this role usually costs locally, and what a dedicated remote hire costs with Remote CoWorker.</w:t>
+        <w:t xml:space="preserve">. In a secret-shopper test of 500 US law firms, only 40% answered the phone. Is this hire meant to make sure every call gets picked up?</w:t>
       </w:r>
     </w:p>
     <w:p>
@@ -1538,7 +1487,7 @@
           <w:iCs w:val="1"/>
           <w:color w:val="1F497D"/>
         </w:rPr>
-        <w:t xml:space="preserve">VA version</w:t>
+        <w:t xml:space="preserve">Admin version, attorney support and paralegals (searches 3b and 3c)</w:t>
       </w:r>
     </w:p>
     <w:p>
@@ -1556,7 +1505,7 @@
           <w:i w:val="1"/>
           <w:iCs w:val="1"/>
         </w:rPr>
-        <w:t xml:space="preserve">I should have introduced myself, </w:t>
+        <w:t xml:space="preserve">Thanks for connecting, </w:t>
       </w:r>
       <w:r>
         <w:rPr>
@@ -1573,7 +1522,24 @@
           <w:i w:val="1"/>
           <w:iCs w:val="1"/>
         </w:rPr>
-        <w:t xml:space="preserve">. I'm Ryan from Remote CoWorker. Hiring a remote assistant yourself means doing the screening, payroll and IT, and starting over when someone leaves. We take all of that on, from $7.99 an hour, and you still interview every candidate. We place receptionists, intake staff, legal assistants and paralegals with US law firms. Would it make sense to look at the </w:t>
+        <w:t xml:space="preserve">. I saw </w:t>
+      </w:r>
+      <w:r>
+        <w:rPr>
+          <w:b w:val="1"/>
+          <w:bCs w:val="1"/>
+          <w:i w:val="1"/>
+          <w:iCs w:val="1"/>
+          <w:color w:val="FF9900"/>
+        </w:rPr>
+        <w:t xml:space="preserve">{company name}</w:t>
+      </w:r>
+      <w:r>
+        <w:rPr>
+          <w:i w:val="1"/>
+          <w:iCs w:val="1"/>
+        </w:rPr>
+        <w:t xml:space="preserve"> is hiring a </w:t>
       </w:r>
       <w:r>
         <w:rPr>
@@ -1590,7 +1556,47 @@
           <w:i w:val="1"/>
           <w:iCs w:val="1"/>
         </w:rPr>
-        <w:t xml:space="preserve"> role this way?</w:t>
+        <w:t xml:space="preserve">. Clio found lawyers bill on average about 3 hours of an eight-hour day. Is this hire meant to take more of the admin off the attorneys?</w:t>
+      </w:r>
+    </w:p>
+    <w:p>
+      <w:pPr>
+        <w:spacing w:before="60" w:after="120"/>
+      </w:pPr>
+      <w:r>
+        <w:rPr>
+          <w:i w:val="1"/>
+          <w:iCs w:val="1"/>
+          <w:color w:val="404040"/>
+          <w:sz w:val="22"/>
+          <w:szCs w:val="22"/>
+        </w:rPr>
+        <w:t xml:space="preserve">Response suggestion: if they're planning more hires, ask which roles come next. If it's intake, ask what happens to calls today when nobody picks up. If it's attorney support, ask where the attorneys lose the most time. Every answer leads into message 2.</w:t>
+      </w:r>
+    </w:p>
+    <w:p>
+      <w:pPr>
+        <w:pStyle w:val="Heading4"/>
+      </w:pPr>
+      <w:r>
+        <w:rPr/>
+        <w:t xml:space="preserve">2</w:t>
+      </w:r>
+      <w:r>
+        <w:rPr>
+          <w:vertAlign w:val="superscript"/>
+        </w:rPr>
+        <w:t xml:space="preserve">nd</w:t>
+      </w:r>
+      <w:r>
+        <w:rPr/>
+        <w:t xml:space="preserve"> Follow-up (3 days after the previous message)</w:t>
+      </w:r>
+    </w:p>
+    <w:p>
+      <w:r>
+        <w:rPr/>
+        <w:t xml:space="preserve">If there's no reply, we introduce ourselves and put the cost side by side: what this role usually costs locally, and what a dedicated remote hire costs with Remote CoWorker.</w:t>
       </w:r>
     </w:p>
     <w:p>
@@ -1605,7 +1611,7 @@
           <w:iCs w:val="1"/>
           <w:color w:val="1F497D"/>
         </w:rPr>
-        <w:t xml:space="preserve">Admin version (intake, receptionist and legal assistant posts)</w:t>
+        <w:t xml:space="preserve">VA version (search 1b)</w:t>
       </w:r>
     </w:p>
     <w:p>
@@ -1640,6 +1646,73 @@
           <w:i w:val="1"/>
           <w:iCs w:val="1"/>
         </w:rPr>
+        <w:t xml:space="preserve">. I'm Ryan from Remote CoWorker. Hiring a remote assistant yourself means doing the screening, payroll and IT, and starting over when someone leaves. We take all of that on, from $7.99 an hour, and you still interview every candidate. We place receptionists, intake staff, legal assistants and paralegals with US law firms. Would it make sense to look at the </w:t>
+      </w:r>
+      <w:r>
+        <w:rPr>
+          <w:b w:val="1"/>
+          <w:bCs w:val="1"/>
+          <w:i w:val="1"/>
+          <w:iCs w:val="1"/>
+          <w:color w:val="FF9900"/>
+        </w:rPr>
+        <w:t xml:space="preserve">{job title}</w:t>
+      </w:r>
+      <w:r>
+        <w:rPr>
+          <w:i w:val="1"/>
+          <w:iCs w:val="1"/>
+        </w:rPr>
+        <w:t xml:space="preserve"> role this way?</w:t>
+      </w:r>
+    </w:p>
+    <w:p>
+      <w:pPr>
+        <w:spacing w:before="240" w:after="0"/>
+      </w:pPr>
+      <w:r>
+        <w:rPr>
+          <w:b w:val="1"/>
+          <w:bCs w:val="1"/>
+          <w:i w:val="1"/>
+          <w:iCs w:val="1"/>
+          <w:color w:val="1F497D"/>
+        </w:rPr>
+        <w:t xml:space="preserve">Admin version, intake, reception and attorney support (searches 3a and 3b)</w:t>
+      </w:r>
+    </w:p>
+    <w:p>
+      <w:pPr>
+        <w:pBdr>
+          <w:top w:color="4f81bd" w:space="10" w:sz="4" w:val="single"/>
+          <w:bottom w:color="4f81bd" w:space="10" w:sz="4" w:val="single"/>
+        </w:pBdr>
+        <w:spacing w:after="240" w:before="240" w:line="240" w:lineRule="auto"/>
+        <w:ind w:left="720"/>
+        <w:jc w:val="left"/>
+      </w:pPr>
+      <w:r>
+        <w:rPr>
+          <w:i w:val="1"/>
+          <w:iCs w:val="1"/>
+        </w:rPr>
+        <w:t xml:space="preserve">I should have introduced myself, </w:t>
+      </w:r>
+      <w:r>
+        <w:rPr>
+          <w:b w:val="1"/>
+          <w:bCs w:val="1"/>
+          <w:i w:val="1"/>
+          <w:iCs w:val="1"/>
+          <w:color w:val="FF9900"/>
+        </w:rPr>
+        <w:t xml:space="preserve">[First Name]</w:t>
+      </w:r>
+      <w:r>
+        <w:rPr>
+          <w:i w:val="1"/>
+          <w:iCs w:val="1"/>
+        </w:rPr>
         <w:t xml:space="preserve">. I'm Ryan from Remote CoWorker. A local legal secretary earns a median $55,570 a year before benefits. A full-time remote hire with us starts at $7.99 an hour, about $16,600 a year, with recruiting, HR, payroll and IT included. Would it make sense to look at the </w:t>
       </w:r>
       <w:r>
@@ -1672,7 +1745,7 @@
           <w:iCs w:val="1"/>
           <w:color w:val="1F497D"/>
         </w:rPr>
-        <w:t xml:space="preserve">Admin version (paralegal and case manager posts)</w:t>
+        <w:t xml:space="preserve">Admin version, paralegals and case managers (search 3c)</w:t>
       </w:r>
     </w:p>
     <w:p>

</xml_diff>